<commit_message>
feat(polish): complete final polish run across admin telemetry, worker safety, clean demo reset, and academic report reflow
</commit_message>
<xml_diff>
--- a/docs/REPORT/ArogyaMitra_BTech_Project_Report.docx
+++ b/docs/REPORT/ArogyaMitra_BTech_Project_Report.docx
@@ -8918,7 +8918,7 @@
         </w:rPr>
         <w:drawing>
           <wp:inline distT="0" distB="0" distL="0" distR="0">
-            <wp:extent cx="4937760" cy="2715768"/>
+            <wp:extent cx="4937760" cy="2777490"/>
             <wp:effectExtent l="0" t="0" r="0" b="0"/>
             <wp:docPr id="1" name="Picture 1"/>
             <wp:cNvGraphicFramePr>
@@ -8940,7 +8940,7 @@
                   <pic:spPr>
                     <a:xfrm>
                       <a:off x="0" y="0"/>
-                      <a:ext cx="4937760" cy="2715768"/>
+                      <a:ext cx="4937760" cy="2777490"/>
                     </a:xfrm>
                     <a:prstGeom prst="rect">
                       <a:avLst/>
@@ -11857,7 +11857,7 @@
         </w:rPr>
         <w:drawing>
           <wp:inline distT="0" distB="0" distL="0" distR="0">
-            <wp:extent cx="4937760" cy="2238451"/>
+            <wp:extent cx="4937760" cy="2304288"/>
             <wp:effectExtent l="0" t="0" r="0" b="0"/>
             <wp:docPr id="2" name="Picture 2"/>
             <wp:cNvGraphicFramePr>
@@ -11879,7 +11879,7 @@
                   <pic:spPr>
                     <a:xfrm>
                       <a:off x="0" y="0"/>
-                      <a:ext cx="4937760" cy="2238451"/>
+                      <a:ext cx="4937760" cy="2304288"/>
                     </a:xfrm>
                     <a:prstGeom prst="rect">
                       <a:avLst/>
@@ -11983,7 +11983,7 @@
         </w:rPr>
         <w:drawing>
           <wp:inline distT="0" distB="0" distL="0" distR="0">
-            <wp:extent cx="4937760" cy="2633472"/>
+            <wp:extent cx="4937760" cy="2468880"/>
             <wp:effectExtent l="0" t="0" r="0" b="0"/>
             <wp:docPr id="3" name="Picture 3"/>
             <wp:cNvGraphicFramePr>
@@ -12005,7 +12005,7 @@
                   <pic:spPr>
                     <a:xfrm>
                       <a:off x="0" y="0"/>
-                      <a:ext cx="4937760" cy="2633472"/>
+                      <a:ext cx="4937760" cy="2468880"/>
                     </a:xfrm>
                     <a:prstGeom prst="rect">
                       <a:avLst/>
@@ -12142,7 +12142,138 @@
           <w:rFonts w:ascii="Times New Roman" w:hAnsi="Times New Roman"/>
           <w:color w:val="212121"/>
         </w:rPr>
-        <w:t>alation &amp; Doctor Review: [PENDING FIX ROUND] Consultation saving upon worker escalation, physician review queue retrieval, doctor response note logging, and worker seeing reviewed status represent ongoing defect-fix enhancements.</w:t>
+        <w:t>alation &amp; Doctor Review: When a worker escalates a consultation, the system persists the case with status 'escalated'. The Medical Officer retrieves pending cases via the review queue, inputs diagnosis notes and prescriptions with OCC version checks, and u</w:t>
+      </w:r>
+      <w:r>
+        <w:rPr>
+          <w:rFonts w:ascii="Times New Roman" w:hAnsi="Times New Roman"/>
+          <w:color w:val="212121"/>
+        </w:rPr>
+        <w:t>pdates status to 'reviewed'. The worker workstation dynamically reflects the doctor's completed assessment upon refresh.</w:t>
+      </w:r>
+    </w:p>
+    <w:p>
+      <w:pPr>
+        <w:spacing w:before="160" w:after="40"/>
+      </w:pPr>
+      <w:r>
+        <w:rPr>
+          <w:rFonts w:ascii="Times New Roman" w:hAnsi="Times New Roman"/>
+          <w:b/>
+          <w:color w:val="212121"/>
+        </w:rPr>
+        <w:t>3.5.1 Verified Clinical Workflow Demonstration</w:t>
+      </w:r>
+    </w:p>
+    <w:p>
+      <w:pPr>
+        <w:spacing w:after="80"/>
+        <w:jc w:val="both"/>
+      </w:pPr>
+      <w:r>
+        <w:rPr>
+          <w:rFonts w:ascii="Times New Roman" w:hAnsi="Times New Roman"/>
+          <w:color w:val="212121"/>
+        </w:rPr>
+        <w:t>The closed-loop consultation lifecycle was executed and verified against the live Docker</w:t>
+      </w:r>
+      <w:r>
+        <w:rPr>
+          <w:rFonts w:ascii="Times New Roman" w:hAnsi="Times New Roman"/>
+          <w:color w:val="212121"/>
+        </w:rPr>
+        <w:t xml:space="preserve"> cluster. The operational sequence progresses deterministically across roles: (1) Frontline worker intake records patient demographics and symptoms, receiving ML-assisted differential diagnosis and Bayesian log-odds feature </w:t>
+      </w:r>
+      <w:r>
+        <w:rPr>
+          <w:rFonts w:ascii="Times New Roman" w:hAnsi="Times New Roman"/>
+          <w:color w:val="212121"/>
+        </w:rPr>
+        <w:lastRenderedPageBreak/>
+        <w:t xml:space="preserve">importance; (2) Red-flag safety </w:t>
+      </w:r>
+      <w:r>
+        <w:rPr>
+          <w:rFonts w:ascii="Times New Roman" w:hAnsi="Times New Roman"/>
+          <w:color w:val="212121"/>
+        </w:rPr>
+        <w:t>interceptor locks triage to emergency upon detection of acute indicators (e.g., chest pain), disabling worker self-acceptance with HTTP 409 RED_FLAG_ACCEPT_BLOCKED; (3) Frontline worker dispatches mandatory escalation note to the Medical Officer queue; (4)</w:t>
+      </w:r>
+      <w:r>
+        <w:rPr>
+          <w:rFonts w:ascii="Times New Roman" w:hAnsi="Times New Roman"/>
+          <w:color w:val="212121"/>
+        </w:rPr>
+        <w:t xml:space="preserve"> Attending physician inspects the pending case with full Bayesian attribution context; (5) Physician records clinical override, prescriptions, and emergency hospital referral under optimistic concurrency control; and (6) System administrator dashboard visu</w:t>
+      </w:r>
+      <w:r>
+        <w:rPr>
+          <w:rFonts w:ascii="Times New Roman" w:hAnsi="Times New Roman"/>
+          <w:color w:val="212121"/>
+        </w:rPr>
+        <w:t>alizes real-time operational telemetry and tamper-evident audit logs without simulated metrics.</w:t>
+      </w:r>
+    </w:p>
+    <w:p>
+      <w:pPr>
+        <w:spacing w:before="120" w:after="40"/>
+        <w:jc w:val="center"/>
+      </w:pPr>
+      <w:r>
+        <w:rPr>
+          <w:noProof/>
+          <w:lang w:val="en-IN" w:eastAsia="en-IN"/>
+        </w:rPr>
+        <w:drawing>
+          <wp:inline distT="0" distB="0" distL="0" distR="0">
+            <wp:extent cx="4937760" cy="5337152"/>
+            <wp:effectExtent l="0" t="0" r="0" b="0"/>
+            <wp:docPr id="4" name="Picture 4"/>
+            <wp:cNvGraphicFramePr>
+              <a:graphicFrameLocks xmlns:a="http://schemas.openxmlformats.org/drawingml/2006/main" noChangeAspect="1"/>
+            </wp:cNvGraphicFramePr>
+            <a:graphic xmlns:a="http://schemas.openxmlformats.org/drawingml/2006/main">
+              <a:graphicData uri="http://schemas.openxmlformats.org/drawingml/2006/picture">
+                <pic:pic xmlns:pic="http://schemas.openxmlformats.org/drawingml/2006/picture">
+                  <pic:nvPicPr>
+                    <pic:cNvPr id="0" name="fig_clinical_workflow_panels.png"/>
+                    <pic:cNvPicPr/>
+                  </pic:nvPicPr>
+                  <pic:blipFill>
+                    <a:blip r:embed="rId13"/>
+                    <a:stretch>
+                      <a:fillRect/>
+                    </a:stretch>
+                  </pic:blipFill>
+                  <pic:spPr>
+                    <a:xfrm>
+                      <a:off x="0" y="0"/>
+                      <a:ext cx="4937760" cy="5337152"/>
+                    </a:xfrm>
+                    <a:prstGeom prst="rect">
+                      <a:avLst/>
+                    </a:prstGeom>
+                  </pic:spPr>
+                </pic:pic>
+              </a:graphicData>
+            </a:graphic>
+          </wp:inline>
+        </w:drawing>
+      </w:r>
+    </w:p>
+    <w:p>
+      <w:pPr>
+        <w:spacing w:before="60" w:after="160"/>
+        <w:jc w:val="center"/>
+      </w:pPr>
+      <w:r>
+        <w:rPr>
+          <w:rFonts w:ascii="Times New Roman" w:hAnsi="Times New Roman"/>
+          <w:b/>
+          <w:color w:val="546E7A"/>
+          <w:sz w:val="19"/>
+        </w:rPr>
+        <w:t>Figure 3.4: Verified End-to-End Clinical Workflow Across Frontline Worker, Doctor, and Admin Interfaces</w:t>
       </w:r>
     </w:p>
     <w:p>
@@ -12156,7 +12287,7 @@
           <w:color w:val="154360"/>
           <w:sz w:val="24"/>
         </w:rPr>
-        <w:t xml:space="preserve">3.6 Security Architecture </w:t>
+        <w:t>3.6 Security Architecture &amp; Cryptographic Implementati</w:t>
       </w:r>
       <w:r>
         <w:rPr>
@@ -12165,7 +12296,7 @@
           <w:color w:val="154360"/>
           <w:sz w:val="24"/>
         </w:rPr>
-        <w:t>&amp; Cryptographic Implementation</w:t>
+        <w:t>on</w:t>
       </w:r>
     </w:p>
     <w:p>
@@ -12191,7 +12322,6 @@
           <w:rFonts w:ascii="Times New Roman" w:hAnsi="Times New Roman"/>
           <w:color w:val="212121"/>
         </w:rPr>
-        <w:lastRenderedPageBreak/>
         <w:t>Layer 1 — Transport Security: Enforces TLS 1.2 and TLS 1.3 encryption with HSTS, X-Content-Type-Options: nosniff, and CSP headers via Nginx.</w:t>
       </w:r>
     </w:p>
@@ -12205,14 +12335,14 @@
           <w:rFonts w:ascii="Times New Roman" w:hAnsi="Times New Roman"/>
           <w:color w:val="212121"/>
         </w:rPr>
-        <w:t>Layer 2 — Gateway R</w:t>
+        <w:t xml:space="preserve">Layer 2 — Gateway Rate Limiting: Restricts </w:t>
       </w:r>
       <w:r>
         <w:rPr>
           <w:rFonts w:ascii="Times New Roman" w:hAnsi="Times New Roman"/>
           <w:color w:val="212121"/>
         </w:rPr>
-        <w:t>ate Limiting: Restricts authentication routes (5 req/15 min) and API routes (100 req/15 min) in production mode.</w:t>
+        <w:t>authentication routes (5 req/15 min) and API routes (100 req/15 min) in production mode.</w:t>
       </w:r>
     </w:p>
     <w:p>
@@ -12225,14 +12355,8 @@
           <w:rFonts w:ascii="Times New Roman" w:hAnsi="Times New Roman"/>
           <w:color w:val="212121"/>
         </w:rPr>
-        <w:t xml:space="preserve">Layer 3 — Authentication &amp; Sessions: Protects passwords using Argon2id (3 iterations, 64 MB RAM, 4 threads). Issues signed JWTs with 15-minute </w:t>
-      </w:r>
-      <w:r>
-        <w:rPr>
-          <w:rFonts w:ascii="Times New Roman" w:hAnsi="Times New Roman"/>
-          <w:color w:val="212121"/>
-        </w:rPr>
-        <w:t>expirations.</w:t>
+        <w:lastRenderedPageBreak/>
+        <w:t>Layer 3 — Authentication &amp; Sessions: Protects passwords using Argon2id (3 iterations, 64 MB RAM, 4 threads). Issues signed JWTs with 15-minute expirations.</w:t>
       </w:r>
     </w:p>
     <w:p>
@@ -12245,14 +12369,14 @@
           <w:rFonts w:ascii="Times New Roman" w:hAnsi="Times New Roman"/>
           <w:color w:val="212121"/>
         </w:rPr>
-        <w:t>Layer 4 — Role-Based Authorization &amp; Org Scoping: Validates user permissions ('worker', 'doctor', 'admin') and enforces organization boundaries (orgScope.middleware.js) so users cannot access data outside their assigned healthcare organization</w:t>
+        <w:t>Layer 4 — R</w:t>
       </w:r>
       <w:r>
         <w:rPr>
           <w:rFonts w:ascii="Times New Roman" w:hAnsi="Times New Roman"/>
           <w:color w:val="212121"/>
         </w:rPr>
-        <w:t>.</w:t>
+        <w:t>ole-Based Authorization &amp; Org Scoping: Validates user permissions ('worker', 'doctor', 'admin') and enforces organization boundaries (orgScope.middleware.js) so users cannot access data outside their assigned healthcare organization.</w:t>
       </w:r>
     </w:p>
     <w:p>
@@ -12265,14 +12389,21 @@
           <w:rFonts w:ascii="Times New Roman" w:hAnsi="Times New Roman"/>
           <w:color w:val="212121"/>
         </w:rPr>
-        <w:t>Layer 5 — Field-Level Encryption: Patient direct identifiers (name, contact, location) are encrypted at rest using AES-256-GCM [15] with unique 96-bit initialization vectors. The multi-layered defense architecture mitigates the OWASP Top 10 web applicati</w:t>
+        <w:t xml:space="preserve">Layer 5 — Field-Level </w:t>
       </w:r>
       <w:r>
         <w:rPr>
           <w:rFonts w:ascii="Times New Roman" w:hAnsi="Times New Roman"/>
           <w:color w:val="212121"/>
         </w:rPr>
-        <w:t>on vulnerabilities [14]. An automated startup guard (encryption_key_exit.test.js) verifies that the backend exits with code 1 if the master key is missing.</w:t>
+        <w:t>Encryption: Patient direct identifiers (name, contact, location) are encrypted at rest using AES-256-GCM [15] with unique 96-bit initialization vectors. The multi-layered defense architecture mitigates the OWASP Top 10 web application vulnerabilities [14].</w:t>
+      </w:r>
+      <w:r>
+        <w:rPr>
+          <w:rFonts w:ascii="Times New Roman" w:hAnsi="Times New Roman"/>
+          <w:color w:val="212121"/>
+        </w:rPr>
+        <w:t xml:space="preserve"> An automated startup guard (encryption_key_exit.test.js) verifies that the backend exits with code 1 if the master key is missing.</w:t>
       </w:r>
     </w:p>
     <w:p>
@@ -12299,14 +12430,14 @@
           <w:rFonts w:ascii="Times New Roman" w:hAnsi="Times New Roman"/>
           <w:color w:val="212121"/>
         </w:rPr>
-        <w:t xml:space="preserve">The persistence layer uses MongoDB 7.0 with five </w:t>
+        <w:t>The persistence layer uses MongoDB 7.0 with five core schemas: Consultatio</w:t>
       </w:r>
       <w:r>
         <w:rPr>
           <w:rFonts w:ascii="Times New Roman" w:hAnsi="Times New Roman"/>
           <w:color w:val="212121"/>
         </w:rPr>
-        <w:t>core schemas: Consultation, User, AuditLog, Organization, and Patient. To preserve data integrity during simultaneous updates, the system implements Optimistic Concurrency Control (OCC) [9] (Kung &amp; Robinson, 1981).</w:t>
+        <w:t>n, User, AuditLog, Organization, and Patient. To preserve data integrity during simultaneous updates, the system implements Optimistic Concurrency Control (OCC) [9] (Kung &amp; Robinson, 1981).</w:t>
       </w:r>
     </w:p>
     <w:p>
@@ -12319,21 +12450,21 @@
           <w:rFonts w:ascii="Times New Roman" w:hAnsi="Times New Roman"/>
           <w:color w:val="212121"/>
         </w:rPr>
-        <w:t>Each consultation document maintains a ve</w:t>
+        <w:t>Each consultation document maintains a version key (__v). When a s</w:t>
       </w:r>
       <w:r>
         <w:rPr>
           <w:rFonts w:ascii="Times New Roman" w:hAnsi="Times New Roman"/>
           <w:color w:val="212121"/>
         </w:rPr>
-        <w:t xml:space="preserve">rsion key (__v). When a status update is submitted, Mongoose executes an atomic conditional update: Consultation.findOneAndUpdate({ _id: id, __v: currentVersion, status: 'PENDING' }, { $set: updateData, $inc: { __v: 1 } }). If another request modified the </w:t>
+        <w:t>tatus update is submitted, Mongoose executes an atomic conditional update: Consultation.findOneAndUpdate({ _id: id, __v: currentVersion, status: 'PENDING' }, { $set: updateData, $inc: { __v: 1 } }). If another request modified the document concurrently, th</w:t>
       </w:r>
       <w:r>
         <w:rPr>
           <w:rFonts w:ascii="Times New Roman" w:hAnsi="Times New Roman"/>
           <w:color w:val="212121"/>
         </w:rPr>
-        <w:t>document concurrently, the version precondition fails, returning an HTTP 409 Conflict error.</w:t>
+        <w:t>e version precondition fails, returning an HTTP 409 Conflict error.</w:t>
       </w:r>
     </w:p>
     <w:p>
@@ -12346,14 +12477,7 @@
           <w:rFonts w:ascii="Times New Roman" w:hAnsi="Times New Roman"/>
           <w:color w:val="212121"/>
         </w:rPr>
-        <w:t>To address worker consultation list latency, server-side pagination (page, limit) and lean Mongoose projections were implemented, reducing data transfer and improv</w:t>
-      </w:r>
-      <w:r>
-        <w:rPr>
-          <w:rFonts w:ascii="Times New Roman" w:hAnsi="Times New Roman"/>
-          <w:color w:val="212121"/>
-        </w:rPr>
-        <w:t>ing response times.</w:t>
+        <w:t>To address worker consultation list latency, server-side pagination (page, limit) and lean Mongoose projections were implemented, reducing data transfer and improving response times.</w:t>
       </w:r>
     </w:p>
     <w:p>
@@ -12367,7 +12491,16 @@
           <w:color w:val="154360"/>
           <w:sz w:val="24"/>
         </w:rPr>
-        <w:t>3.8 Logging and Audit System</w:t>
+        <w:t>3.8 L</w:t>
+      </w:r>
+      <w:r>
+        <w:rPr>
+          <w:rFonts w:ascii="Times New Roman" w:hAnsi="Times New Roman"/>
+          <w:b/>
+          <w:color w:val="154360"/>
+          <w:sz w:val="24"/>
+        </w:rPr>
+        <w:t>ogging and Audit System</w:t>
       </w:r>
     </w:p>
     <w:p>
@@ -12380,14 +12513,14 @@
           <w:rFonts w:ascii="Times New Roman" w:hAnsi="Times New Roman"/>
           <w:color w:val="212121"/>
         </w:rPr>
-        <w:t>ArogyaMitra implements structured, PII-free JSON logging via piiFreeLoggingMiddleware in Backend/src/middlewares/logging.middleware.js. All incoming HTTP requests receive a unique X-Request-Id. Sensitive fie</w:t>
+        <w:t>ArogyaMitra implements structured, PII-free JSON logging via piiFreeLoggingMiddleware in Backend/src/middlewares/logging.middleware.js. All incoming HTTP requests receive a unique X-Request-Id. Sensitive fields (passwords, tokens, p</w:t>
       </w:r>
       <w:r>
         <w:rPr>
           <w:rFonts w:ascii="Times New Roman" w:hAnsi="Times New Roman"/>
           <w:color w:val="212121"/>
         </w:rPr>
-        <w:t>lds (passwords, tokens, patient names, phone numbers) are stripped by sanitizeForLogging before logs are written.</w:t>
+        <w:t>atient names, phone numbers) are stripped by sanitizeForLogging before logs are written.</w:t>
       </w:r>
     </w:p>
     <w:p>
@@ -12439,16 +12572,7 @@
                 <w:color w:val="154360"/>
                 <w:sz w:val="19"/>
               </w:rPr>
-              <w:t>[Li</w:t>
-            </w:r>
-            <w:r>
-              <w:rPr>
-                <w:rFonts w:ascii="Times New Roman" w:hAnsi="Times New Roman"/>
-                <w:b/>
-                <w:color w:val="154360"/>
-                <w:sz w:val="19"/>
-              </w:rPr>
-              <w:t xml:space="preserve">sting 3.1: Structured PII-Free JSON Access Log Excerpts] </w:t>
+              <w:t xml:space="preserve">[Listing 3.1: Structured PII-Free JSON Access Log Excerpts] </w:t>
             </w:r>
             <w:r>
               <w:rPr>
@@ -12457,7 +12581,7 @@
                 <w:color w:val="212121"/>
                 <w:sz w:val="19"/>
               </w:rPr>
-              <w:t>{"timestamp":"2026-10-31T23:46:08.147Z","requestId":"d46bea0c-0255-4d13-8abd-8ae7f7da222e","method":"POST","path":"/api/v1/consultation","statusCode":201,"durationMs":84,"role":"Worker","organization</w:t>
+              <w:t>{"timestamp":"2026-10-31T23:46:08.147Z","requestId":"d46bea0c-0255-4d13-8abd-8ae7f7da222e","method":"POST","path":"/api/v1/consultation","statusCode":201,"durationMs":84,"role":"Worker","organizat</w:t>
             </w:r>
             <w:r>
               <w:rPr>
@@ -12466,7 +12590,7 @@
                 <w:color w:val="212121"/>
                 <w:sz w:val="19"/>
               </w:rPr>
-              <w:t>":"6ae673842406379e020d1401"}</w:t>
+              <w:t>ion":"6ae673842406379e020d1401"}</w:t>
             </w:r>
             <w:r>
               <w:rPr>
@@ -12476,7 +12600,7 @@
                 <w:sz w:val="19"/>
               </w:rPr>
               <w:br/>
-              <w:t>{"timestamp":"2026-10-31T23:46:11.005Z","requestId":"6fac6e95-1ced-4ac9-bfa0-2be960a001e9","method":"GET","path":"/api/v1/consultation/pending","statusCode":200,"durationMs":34,"role":"Doctor","organization":"6ae673842406379e0</w:t>
+              <w:t>{"timestamp":"2026-10-31T23:46:11.005Z","requestId":"6fac6e95-1ced-4ac9-bfa0-2be960a001e9","method":"GET","path":"/api/v1/consultation/pending","statusCode":200,"durationMs":34,"role":"Doctor","organization":"6ae67384240637</w:t>
             </w:r>
             <w:r>
               <w:rPr>
@@ -12485,7 +12609,7 @@
                 <w:color w:val="212121"/>
                 <w:sz w:val="19"/>
               </w:rPr>
-              <w:t>20d1401"}</w:t>
+              <w:t>9e020d1401"}</w:t>
             </w:r>
             <w:r>
               <w:rPr>
@@ -12495,7 +12619,7 @@
                 <w:sz w:val="19"/>
               </w:rPr>
               <w:br/>
-              <w:t>{"timestamp":"2026-10-31T23:46:13.550Z","requestId":"ae7ab4d0-c27c-41c4-a89d-c944725df9f6","method":"PATCH","path":"/api/v1/consultation/6ae67dc06a8649a948b9ef85/respond","statusCode":200,"durationMs":80,"role":"Doctor","organization":"6ae6738424</w:t>
+              <w:t>{"timestamp":"2026-10-31T23:46:13.550Z","requestId":"ae7ab4d0-c27c-41c4-a89d-c944725df9f6","method":"PATCH","path":"/api/v1/consultation/6ae67dc06a8649a948b9ef85/respond","statusCode":200,"durationMs":80,"role":"Doctor","organization":"6ae6738</w:t>
             </w:r>
             <w:r>
               <w:rPr>
@@ -12504,7 +12628,7 @@
                 <w:color w:val="212121"/>
                 <w:sz w:val="19"/>
               </w:rPr>
-              <w:t>06379e020d1401"}</w:t>
+              <w:t>42406379e020d1401"}</w:t>
             </w:r>
           </w:p>
         </w:tc>
@@ -12610,7 +12734,7 @@
           <wp:inline distT="0" distB="0" distL="0" distR="0">
             <wp:extent cx="4023360" cy="2779776"/>
             <wp:effectExtent l="0" t="0" r="0" b="0"/>
-            <wp:docPr id="4" name="Picture 4"/>
+            <wp:docPr id="5" name="Picture 5"/>
             <wp:cNvGraphicFramePr>
               <a:graphicFrameLocks xmlns:a="http://schemas.openxmlformats.org/drawingml/2006/main" noChangeAspect="1"/>
             </wp:cNvGraphicFramePr>
@@ -12622,7 +12746,7 @@
                     <pic:cNvPicPr/>
                   </pic:nvPicPr>
                   <pic:blipFill>
-                    <a:blip r:embed="rId13"/>
+                    <a:blip r:embed="rId14"/>
                     <a:stretch>
                       <a:fillRect/>
                     </a:stretch>
@@ -12723,7 +12847,7 @@
                 <w:color w:val="212121"/>
                 <w:sz w:val="19"/>
               </w:rPr>
-              <w:t xml:space="preserve">Dataset Scope: All machine learning models were </w:t>
+              <w:t>Dataset Scope: All machine learning models were eval</w:t>
             </w:r>
             <w:r>
               <w:rPr>
@@ -12732,7 +12856,7 @@
                 <w:color w:val="212121"/>
                 <w:sz w:val="19"/>
               </w:rPr>
-              <w:t>evaluated on synthetic tabular data (304 unique rows across 41 classes and 131 symptoms). The dataset contains no real-patient records, lacks continuous clinical covariates (such as blood pressure or lab markers), and does not represent complex multi-morbi</w:t>
+              <w:t>uated on synthetic tabular data (304 unique rows across 41 classes and 131 symptoms). The dataset contains no real-patient records, lacks continuous clinical covariates (such as blood pressure or lab markers), and does not represent complex multi-morbid cl</w:t>
             </w:r>
             <w:r>
               <w:rPr>
@@ -12741,7 +12865,7 @@
                 <w:color w:val="212121"/>
                 <w:sz w:val="19"/>
               </w:rPr>
-              <w:t>d clinical populations.</w:t>
+              <w:t>inical populations.</w:t>
             </w:r>
           </w:p>
         </w:tc>
@@ -12776,14 +12900,14 @@
           <w:rFonts w:ascii="Times New Roman" w:hAnsi="Times New Roman"/>
           <w:color w:val="212121"/>
         </w:rPr>
-        <w:t>To evaluate diagnostic robustness under missing clinical data, models were benchmarked using a 5-fold by 3-repeat (15 splits) Stratified Cross-Validation protocol on the 304 unique row</w:t>
+        <w:t>To evaluate diagnostic robustness under missing clinical data, models were benchmarked using a 5-fold by 3-repeat (15 splits) Stratified Cross-Validation protocol on the 304 unique rows. I</w:t>
       </w:r>
       <w:r>
         <w:rPr>
           <w:rFonts w:ascii="Times New Roman" w:hAnsi="Times New Roman"/>
           <w:color w:val="212121"/>
         </w:rPr>
-        <w:t>s. In each fold, symptoms were subjected to in-fold random symptom dropout (masking 0%, 30%, and 50% of present symptoms) to simulate incomplete health worker data collection.</w:t>
+        <w:t>n each fold, symptoms were subjected to in-fold random symptom dropout (masking 0%, 30%, and 50% of present symptoms) to simulate incomplete health worker data collection.</w:t>
       </w:r>
     </w:p>
     <w:p>
@@ -12797,14 +12921,14 @@
           <w:color w:val="212121"/>
         </w:rPr>
         <w:lastRenderedPageBreak/>
-        <w:t xml:space="preserve">Table 4.1 presents the comparison between Bernoulli Naive Bayes, Tuned LightGBM </w:t>
+        <w:t>Table 4.1 presents the comparison between Bernoulli Naive Bayes, Tuned LightGBM [4],</w:t>
       </w:r>
       <w:r>
         <w:rPr>
           <w:rFonts w:ascii="Times New Roman" w:hAnsi="Times New Roman"/>
           <w:color w:val="212121"/>
         </w:rPr>
-        <w:t>[4], and Tuned XGBoost across all dropout levels. All metrics trace directly to docs/evidence/model_benchmark.md:14,31,48 and docs/evidence/tuned_tree_benchmark.md:12-17.</w:t>
+        <w:t xml:space="preserve"> and Tuned XGBoost across all dropout levels. All metrics trace directly to docs/evidence/model_benchmark.md:14,31,48 and docs/evidence/tuned_tree_benchmark.md:12-17.</w:t>
       </w:r>
     </w:p>
     <w:p>
@@ -12865,7 +12989,7 @@
                 <w:color w:val="FFFFFF"/>
                 <w:sz w:val="17"/>
               </w:rPr>
-              <w:t>Model Arc</w:t>
+              <w:t>Model Archite</w:t>
             </w:r>
             <w:r>
               <w:rPr>
@@ -12874,7 +12998,7 @@
                 <w:color w:val="FFFFFF"/>
                 <w:sz w:val="17"/>
               </w:rPr>
-              <w:t>hitecture</w:t>
+              <w:t>cture</w:t>
             </w:r>
           </w:p>
         </w:tc>
@@ -13829,7 +13953,7 @@
           <wp:inline distT="0" distB="0" distL="0" distR="0">
             <wp:extent cx="4937760" cy="2073859"/>
             <wp:effectExtent l="0" t="0" r="0" b="0"/>
-            <wp:docPr id="5" name="Picture 5"/>
+            <wp:docPr id="6" name="Picture 6"/>
             <wp:cNvGraphicFramePr>
               <a:graphicFrameLocks xmlns:a="http://schemas.openxmlformats.org/drawingml/2006/main" noChangeAspect="1"/>
             </wp:cNvGraphicFramePr>
@@ -13841,7 +13965,7 @@
                     <pic:cNvPicPr/>
                   </pic:nvPicPr>
                   <pic:blipFill>
-                    <a:blip r:embed="rId14"/>
+                    <a:blip r:embed="rId15"/>
                     <a:stretch>
                       <a:fillRect/>
                     </a:stretch>
@@ -14805,7 +14929,7 @@
           <wp:inline distT="0" distB="0" distL="0" distR="0">
             <wp:extent cx="4937760" cy="1975104"/>
             <wp:effectExtent l="0" t="0" r="0" b="0"/>
-            <wp:docPr id="6" name="Picture 6"/>
+            <wp:docPr id="7" name="Picture 7"/>
             <wp:cNvGraphicFramePr>
               <a:graphicFrameLocks xmlns:a="http://schemas.openxmlformats.org/drawingml/2006/main" noChangeAspect="1"/>
             </wp:cNvGraphicFramePr>
@@ -14817,7 +14941,7 @@
                     <pic:cNvPicPr/>
                   </pic:nvPicPr>
                   <pic:blipFill>
-                    <a:blip r:embed="rId15"/>
+                    <a:blip r:embed="rId16"/>
                     <a:stretch>
                       <a:fillRect/>
                     </a:stretch>
@@ -15542,7 +15666,7 @@
           <wp:inline distT="0" distB="0" distL="0" distR="0">
             <wp:extent cx="4754880" cy="2633472"/>
             <wp:effectExtent l="0" t="0" r="0" b="0"/>
-            <wp:docPr id="7" name="Picture 7"/>
+            <wp:docPr id="8" name="Picture 8"/>
             <wp:cNvGraphicFramePr>
               <a:graphicFrameLocks xmlns:a="http://schemas.openxmlformats.org/drawingml/2006/main" noChangeAspect="1"/>
             </wp:cNvGraphicFramePr>
@@ -15554,7 +15678,7 @@
                     <pic:cNvPicPr/>
                   </pic:nvPicPr>
                   <pic:blipFill>
-                    <a:blip r:embed="rId16"/>
+                    <a:blip r:embed="rId17"/>
                     <a:stretch>
                       <a:fillRect/>
                     </a:stretch>
@@ -16484,7 +16608,7 @@
           <wp:inline distT="0" distB="0" distL="0" distR="0">
             <wp:extent cx="4937760" cy="3089140"/>
             <wp:effectExtent l="0" t="0" r="0" b="0"/>
-            <wp:docPr id="8" name="Picture 8"/>
+            <wp:docPr id="9" name="Picture 9"/>
             <wp:cNvGraphicFramePr>
               <a:graphicFrameLocks xmlns:a="http://schemas.openxmlformats.org/drawingml/2006/main" noChangeAspect="1"/>
             </wp:cNvGraphicFramePr>
@@ -16496,7 +16620,7 @@
                     <pic:cNvPicPr/>
                   </pic:nvPicPr>
                   <pic:blipFill>
-                    <a:blip r:embed="rId17"/>
+                    <a:blip r:embed="rId18"/>
                     <a:stretch>
                       <a:fillRect/>
                     </a:stretch>
@@ -17453,14 +17577,14 @@
           <w:rFonts w:ascii="Times New Roman" w:hAnsi="Times New Roman"/>
           <w:color w:val="212121"/>
         </w:rPr>
-        <w:t>4. Safe Mode as Usual Demo Path: Due to external Gemini API rate limits and model deprecations, Safe Mode (deterministic fallback templates) is the usual execution path during continuous testin</w:t>
+        <w:t xml:space="preserve">4. Safe Mode as an Automated Resilience Mechanism: Due to external Gemini API rate limits (HTTP 429) and upstream model lifecycle changes, Safe Mode serves as an automated, verified rule-based </w:t>
       </w:r>
       <w:r>
         <w:rPr>
           <w:rFonts w:ascii="Times New Roman" w:hAnsi="Times New Roman"/>
           <w:color w:val="212121"/>
         </w:rPr>
-        <w:t>g.</w:t>
+        <w:t>resilience mechanism rather than an ad-hoc fallback. It deterministically renders pre-compiled clinical templates, ensuring zero service disruption and bounding latency during network or cloud provider outages.</w:t>
       </w:r>
     </w:p>
     <w:p>
@@ -17473,7 +17597,14 @@
           <w:rFonts w:ascii="Times New Roman" w:hAnsi="Times New Roman"/>
           <w:color w:val="212121"/>
         </w:rPr>
-        <w:t>5. Draft Fallback Templates: Clinical fallback templates remain labeled DRAFT pending review by a licensed medical board.</w:t>
+        <w:t>5. Draft Fallback Templates: Clinical fallbac</w:t>
+      </w:r>
+      <w:r>
+        <w:rPr>
+          <w:rFonts w:ascii="Times New Roman" w:hAnsi="Times New Roman"/>
+          <w:color w:val="212121"/>
+        </w:rPr>
+        <w:t>k templates remain labeled DRAFT pending review by a licensed medical board.</w:t>
       </w:r>
     </w:p>
     <w:p>
@@ -17486,14 +17617,7 @@
           <w:rFonts w:ascii="Times New Roman" w:hAnsi="Times New Roman"/>
           <w:color w:val="212121"/>
         </w:rPr>
-        <w:t xml:space="preserve">6. Self-Signed TLS Certificate: The gateway uses a self-signed certificate for arogyamitra.local, requiring explicit trust in test </w:t>
-      </w:r>
-      <w:r>
-        <w:rPr>
-          <w:rFonts w:ascii="Times New Roman" w:hAnsi="Times New Roman"/>
-          <w:color w:val="212121"/>
-        </w:rPr>
-        <w:t>environments.</w:t>
+        <w:t>6. Self-Signed TLS Certificate: The gateway uses a self-signed certificate for arogyamitra.local, requiring explicit trust in test environments.</w:t>
       </w:r>
     </w:p>
     <w:p>
@@ -17506,7 +17630,14 @@
           <w:rFonts w:ascii="Times New Roman" w:hAnsi="Times New Roman"/>
           <w:color w:val="212121"/>
         </w:rPr>
-        <w:t>7. Single-Replica Stack: Runs as single-replica containers on a single host node without multi-region clustering or Kubernetes autoscaling.</w:t>
+        <w:t xml:space="preserve">7. Single-Replica Stack: Runs as </w:t>
+      </w:r>
+      <w:r>
+        <w:rPr>
+          <w:rFonts w:ascii="Times New Roman" w:hAnsi="Times New Roman"/>
+          <w:color w:val="212121"/>
+        </w:rPr>
+        <w:t>single-replica containers on a single host node without multi-region clustering or Kubernetes autoscaling.</w:t>
       </w:r>
     </w:p>
     <w:p>
@@ -17519,14 +17650,7 @@
           <w:rFonts w:ascii="Times New Roman" w:hAnsi="Times New Roman"/>
           <w:color w:val="212121"/>
         </w:rPr>
-        <w:t xml:space="preserve">8. In-Memory Rate Limiting: Rate limit counters reside in local Node.js process memory rather than a </w:t>
-      </w:r>
-      <w:r>
-        <w:rPr>
-          <w:rFonts w:ascii="Times New Roman" w:hAnsi="Times New Roman"/>
-          <w:color w:val="212121"/>
-        </w:rPr>
-        <w:t>shared Redis store.</w:t>
+        <w:t>8. In-Memory Rate Limiting: Rate limit counters reside in local Node.js process memory rather than a shared Redis store.</w:t>
       </w:r>
     </w:p>
     <w:p>
@@ -17539,7 +17663,14 @@
           <w:rFonts w:ascii="Times New Roman" w:hAnsi="Times New Roman"/>
           <w:color w:val="212121"/>
         </w:rPr>
-        <w:t>9. Offline Scope: Inference requires network connection to the local Docker gateway; fully offline in-browser execution is not yet compiled.</w:t>
+        <w:t xml:space="preserve">9. Offline Scope: Inference </w:t>
+      </w:r>
+      <w:r>
+        <w:rPr>
+          <w:rFonts w:ascii="Times New Roman" w:hAnsi="Times New Roman"/>
+          <w:color w:val="212121"/>
+        </w:rPr>
+        <w:t>requires network connection to the local Docker gateway; fully offline in-browser execution is not yet compiled.</w:t>
       </w:r>
     </w:p>
     <w:p>
@@ -17552,14 +17683,14 @@
           <w:rFonts w:ascii="Times New Roman" w:hAnsi="Times New Roman"/>
           <w:color w:val="212121"/>
         </w:rPr>
-        <w:t xml:space="preserve">10. Devanagari Typography: ReportLab lacks HarfBuzz complex script shaping, causing occasional </w:t>
+        <w:t xml:space="preserve">10. Devanagari Typography: ReportLab lacks HarfBuzz complex script shaping, causing occasional mispositioned vowel matras in Hindi and Marathi </w:t>
       </w:r>
       <w:r>
         <w:rPr>
           <w:rFonts w:ascii="Times New Roman" w:hAnsi="Times New Roman"/>
           <w:color w:val="212121"/>
         </w:rPr>
-        <w:t>mispositioned vowel matras in Hindi and Marathi PDFs.</w:t>
+        <w:t>PDFs.</w:t>
       </w:r>
     </w:p>
     <w:p>
@@ -17573,14 +17704,14 @@
           <w:color w:val="212121"/>
         </w:rPr>
         <w:lastRenderedPageBreak/>
-        <w:t>Earlier prototype workflow defects (escalation persistence, physician queue retrieval, second-opinion saving, worker review visibility, and session expiry handling) were comprehensively remediated and v</w:t>
+        <w:t>Earlier prototype workflow defects (escalation persistence, physician queue retrieval, second-opinion saving, worker review visibility, and session expiry handling) were comprehensively remediated and verified in the remediation branch across 11/11 P</w:t>
       </w:r>
       <w:r>
         <w:rPr>
           <w:rFonts w:ascii="Times New Roman" w:hAnsi="Times New Roman"/>
           <w:color w:val="212121"/>
         </w:rPr>
-        <w:t>erified in the remediation branch across 11/11 Playwright journeys.</w:t>
+        <w:t>laywright journeys.</w:t>
       </w:r>
     </w:p>
     <w:p>
@@ -17627,21 +17758,21 @@
           <w:rFonts w:ascii="Times New Roman" w:hAnsi="Times New Roman"/>
           <w:color w:val="212121"/>
         </w:rPr>
-        <w:t>In this project, I engineered and evaluated ArogyaMitra, an explainable and fail-closed AI-assisted clinical decis</w:t>
+        <w:t>In this project, I engineered and evaluated ArogyaMitra, an explainable and fail-closed AI-assisted clinical decision support system prototype for community healt</w:t>
       </w:r>
       <w:r>
         <w:rPr>
           <w:rFonts w:ascii="Times New Roman" w:hAnsi="Times New Roman"/>
           <w:color w:val="212121"/>
         </w:rPr>
-        <w:t>ion support system prototype for community healthcare workers. Addressing vulnerabilities documented in clinical literature—specifically diagnostic inaccuracy in symptom checkers (Wallace et al. [1]) and uncalibrated posteriors in Naive Bayes (Niculescu-Mi</w:t>
+        <w:t>hcare workers. Addressing vulnerabilities documented in clinical literature—specifically diagnostic inaccuracy in symptom checkers (Wallace et al. [1]) and uncalibrated posteriors in Naive Bayes (Niculescu-Mizil &amp; Caruana [2])—I achieved the following engi</w:t>
       </w:r>
       <w:r>
         <w:rPr>
           <w:rFonts w:ascii="Times New Roman" w:hAnsi="Times New Roman"/>
           <w:color w:val="212121"/>
         </w:rPr>
-        <w:t>zil &amp; Caruana [2])—I achieved the following engineering outcomes:</w:t>
+        <w:t>neering outcomes:</w:t>
       </w:r>
     </w:p>
     <w:p>
@@ -17654,14 +17785,7 @@
           <w:rFonts w:ascii="Times New Roman" w:hAnsi="Times New Roman"/>
           <w:color w:val="212121"/>
         </w:rPr>
-        <w:t>1. Deduplicated Baseline Benchmark: Identified and removed a 93.8% synthetic duplication artifact in raw public clinical data, establishing a clean 304-row benchmark across 41 disease classe</w:t>
-      </w:r>
-      <w:r>
-        <w:rPr>
-          <w:rFonts w:ascii="Times New Roman" w:hAnsi="Times New Roman"/>
-          <w:color w:val="212121"/>
-        </w:rPr>
-        <w:t>s and 131 symptoms.</w:t>
+        <w:t>1. Deduplicated Baseline Benchmark: Identified and removed a 93.8% synthetic duplication artifact in raw public clinical data, establishing a clean 304-row benchmark across 41 disease classes and 131 symptoms.</w:t>
       </w:r>
     </w:p>
     <w:p>
@@ -17674,14 +17798,14 @@
           <w:rFonts w:ascii="Times New Roman" w:hAnsi="Times New Roman"/>
           <w:color w:val="212121"/>
         </w:rPr>
-        <w:t>2. Robust Bayesian Inference: Evaluated stateless Bernoulli Naive Bayes against tuned gradient-boosted trees under symptom dropout, demonstrating 0.919 accuracy vs. 0.683 for LightGBM at 50% missing data, with an inference execution tim</w:t>
+        <w:t>2. Robust Bayesian Inference</w:t>
       </w:r>
       <w:r>
         <w:rPr>
           <w:rFonts w:ascii="Times New Roman" w:hAnsi="Times New Roman"/>
           <w:color w:val="212121"/>
         </w:rPr>
-        <w:t>e of 1.8 ms in internal container benchmarks.</w:t>
+        <w:t>: Evaluated stateless Bernoulli Naive Bayes against tuned gradient-boosted trees under symptom dropout, demonstrating 0.919 accuracy vs. 0.683 for LightGBM at 50% missing data, with an inference execution time of 1.8 ms in internal container benchmarks.</w:t>
       </w:r>
     </w:p>
     <w:p>
@@ -17694,7 +17818,14 @@
           <w:rFonts w:ascii="Times New Roman" w:hAnsi="Times New Roman"/>
           <w:color w:val="212121"/>
         </w:rPr>
-        <w:t>3. Closed-Form Feature Attribution: Derived exact mathematical log-odds symptom attributions satisfying additive efficiency without sampling approximations.</w:t>
+        <w:t>3.</w:t>
+      </w:r>
+      <w:r>
+        <w:rPr>
+          <w:rFonts w:ascii="Times New Roman" w:hAnsi="Times New Roman"/>
+          <w:color w:val="212121"/>
+        </w:rPr>
+        <w:t xml:space="preserve"> Closed-Form Feature Attribution: Derived exact mathematical log-odds symptom attributions satisfying additive efficiency without sampling approximations.</w:t>
       </w:r>
     </w:p>
     <w:p>
@@ -17707,21 +17838,14 @@
           <w:rFonts w:ascii="Times New Roman" w:hAnsi="Times New Roman"/>
           <w:color w:val="212121"/>
         </w:rPr>
-        <w:t xml:space="preserve">4. Fail-Closed Safety Architecture: Decoupled </w:t>
+        <w:t>4. Fail-Closed Safety Architecture: Decoupled emergency detection from classification via determinist</w:t>
       </w:r>
       <w:r>
         <w:rPr>
           <w:rFonts w:ascii="Times New Roman" w:hAnsi="Times New Roman"/>
           <w:color w:val="212121"/>
         </w:rPr>
-        <w:t xml:space="preserve">emergency detection from classification via deterministic red-flag overrides; isolated the LLM narrative layer behind 10s/20s timeout caps and confidence filters backed by pre-compiled templates; and replaced client-side mocks with explicit HTTP 503 error </w:t>
-      </w:r>
-      <w:r>
-        <w:rPr>
-          <w:rFonts w:ascii="Times New Roman" w:hAnsi="Times New Roman"/>
-          <w:color w:val="212121"/>
-        </w:rPr>
-        <w:t>states.</w:t>
+        <w:t>ic red-flag overrides; isolated the LLM narrative layer behind 10s/20s timeout caps and confidence filters backed by pre-compiled templates; and replaced client-side mocks with explicit HTTP 503 error states.</w:t>
       </w:r>
     </w:p>
     <w:p>
@@ -17734,14 +17858,14 @@
           <w:rFonts w:ascii="Times New Roman" w:hAnsi="Times New Roman"/>
           <w:color w:val="212121"/>
         </w:rPr>
-        <w:t>5. Layered Container Security &amp; Verification: Enforced TLS 1.2/1.3, Argon2id hashing, AES-256-GCM field encryption, and optimistic concurrency controls (__v). Achieved zero fixable Critical/High (Trivy --ignore-unfixed) container vulnerabilities an</w:t>
+        <w:t>5. Layered Container Security &amp; Verification: E</w:t>
       </w:r>
       <w:r>
         <w:rPr>
           <w:rFonts w:ascii="Times New Roman" w:hAnsi="Times New Roman"/>
           <w:color w:val="212121"/>
         </w:rPr>
-        <w:t>d 100% pass rates across 322 automated prototype tests.</w:t>
+        <w:t>nforced TLS 1.2/1.3, Argon2id hashing, AES-256-GCM field encryption, and optimistic concurrency controls (__v). Achieved zero fixable Critical/High (Trivy --ignore-unfixed) container vulnerabilities and 100% pass rates across 322 automated prototype tests.</w:t>
       </w:r>
     </w:p>
     <w:p>
@@ -17781,14 +17905,14 @@
           <w:rFonts w:ascii="Times New Roman" w:hAnsi="Times New Roman"/>
           <w:color w:val="212121"/>
         </w:rPr>
-        <w:t>1. Danger of Silent Fallback Mocks: Returning canned predictions during a s</w:t>
+        <w:t>1. Danger of Silent Fallback Mocks: Returning canned predictions during a service outage creates clinical hazards. Designing for f</w:t>
       </w:r>
       <w:r>
         <w:rPr>
           <w:rFonts w:ascii="Times New Roman" w:hAnsi="Times New Roman"/>
           <w:color w:val="212121"/>
         </w:rPr>
-        <w:t>ervice outage creates clinical hazards. Designing for fail-closed behavior—explicitly halting unsafe workflows and returning HTTP 503—is essential in healthcare software.</w:t>
+        <w:t>ail-closed behavior—explicitly halting unsafe workflows and returning HTTP 503—is essential in healthcare software.</w:t>
       </w:r>
     </w:p>
     <w:p>
@@ -17801,14 +17925,14 @@
           <w:rFonts w:ascii="Times New Roman" w:hAnsi="Times New Roman"/>
           <w:color w:val="212121"/>
         </w:rPr>
-        <w:t>2. Calibration Limits on Small Cohorts: Demonstrating that Platt scaling degraded log</w:t>
+        <w:t>2. Calibration Limits on Small Cohorts: Demonstrating that Platt scaling degraded log loss on 304 unique rows confirmed that parametric cali</w:t>
       </w:r>
       <w:r>
         <w:rPr>
           <w:rFonts w:ascii="Times New Roman" w:hAnsi="Times New Roman"/>
           <w:color w:val="212121"/>
         </w:rPr>
-        <w:t xml:space="preserve"> loss on 304 unique rows confirmed that parametric calibration cannot be applied uncritically to small clinical datasets. Scores must be transparently communicated as uncalibrated estimates.</w:t>
+        <w:t>bration cannot be applied uncritically to small clinical datasets. Scores must be transparently communicated as uncalibrated estimates.</w:t>
       </w:r>
     </w:p>
     <w:p>
@@ -17821,14 +17945,14 @@
           <w:rFonts w:ascii="Times New Roman" w:hAnsi="Times New Roman"/>
           <w:color w:val="212121"/>
         </w:rPr>
-        <w:t>3. Combined Profiling &amp; Optimization: Profiling revealed that unp</w:t>
+        <w:t>3. Combined Profiling &amp; Optimization: Profiling revealed that unpaginated queries dominated list latency. Implementing s</w:t>
       </w:r>
       <w:r>
         <w:rPr>
           <w:rFonts w:ascii="Times New Roman" w:hAnsi="Times New Roman"/>
           <w:color w:val="212121"/>
         </w:rPr>
-        <w:t>aginated queries dominated list latency. Implementing server-side pagination and projection yielded a 60.5% p50 latency reduction, confirming the value of targeted optimization.</w:t>
+        <w:t>erver-side pagination and projection yielded a 60.5% p50 latency reduction, confirming the value of targeted optimization.</w:t>
       </w:r>
     </w:p>
     <w:p>
@@ -17868,14 +17992,14 @@
           <w:rFonts w:ascii="Times New Roman" w:hAnsi="Times New Roman"/>
           <w:color w:val="212121"/>
         </w:rPr>
-        <w:t>1. Pr</w:t>
+        <w:t>1. Prospective Clinical Pilot: Conduct observational studies</w:t>
       </w:r>
       <w:r>
         <w:rPr>
           <w:rFonts w:ascii="Times New Roman" w:hAnsi="Times New Roman"/>
           <w:color w:val="212121"/>
         </w:rPr>
-        <w:t>ospective Clinical Pilot: Conduct observational studies in Health and Wellness Centres to evaluate concordance between health worker triage recommendations and Medical Officer diagnoses.</w:t>
+        <w:t xml:space="preserve"> in Health and Wellness Centres to evaluate concordance between health worker triage recommendations and Medical Officer diagnoses.</w:t>
       </w:r>
     </w:p>
     <w:p>
@@ -17888,14 +18012,14 @@
           <w:rFonts w:ascii="Times New Roman" w:hAnsi="Times New Roman"/>
           <w:color w:val="212121"/>
         </w:rPr>
-        <w:t>2. ABHA &amp; ABDM Ecosystem Integration: Implement standardized HL7 FHIR</w:t>
+        <w:t>2. ABHA &amp; ABDM Ecosystem Integration: Implement standardized HL7 FHIR interfaces for bidirectional health record synchroniza</w:t>
       </w:r>
       <w:r>
         <w:rPr>
           <w:rFonts w:ascii="Times New Roman" w:hAnsi="Times New Roman"/>
           <w:color w:val="212121"/>
         </w:rPr>
-        <w:t xml:space="preserve"> interfaces for bidirectional health record synchronization with the Ayushman Bharat Digital Mission.</w:t>
+        <w:t>tion with the Ayushman Bharat Digital Mission.</w:t>
       </w:r>
     </w:p>
     <w:p>
@@ -17922,14 +18046,14 @@
           <w:color w:val="212121"/>
         </w:rPr>
         <w:lastRenderedPageBreak/>
-        <w:t>4. Non-Parametric C</w:t>
+        <w:t>4. Non-Parametric Calibration on Clinical Cohorts: When genuine multi-thou</w:t>
       </w:r>
       <w:r>
         <w:rPr>
           <w:rFonts w:ascii="Times New Roman" w:hAnsi="Times New Roman"/>
           <w:color w:val="212121"/>
         </w:rPr>
-        <w:t>alibration on Clinical Cohorts: When genuine multi-thousand patient cohorts become available, train non-parametric calibration models (such as beta calibration) to deliver calibrated risk intervals.</w:t>
+        <w:t>sand patient cohorts become available, train non-parametric calibration models (such as beta calibration) to deliver calibrated risk intervals.</w:t>
       </w:r>
     </w:p>
     <w:p>
@@ -17971,14 +18095,14 @@
           <w:rFonts w:ascii="Times New Roman" w:hAnsi="Times New Roman"/>
           <w:sz w:val="19"/>
         </w:rPr>
-        <w:t xml:space="preserve">Wallace, W., Chan, C., Chidambaram, S., </w:t>
+        <w:t>Wallace, W., Chan, C., Chidambaram, S., et al. (2022). The diagnostic and triage accuracy of di</w:t>
       </w:r>
       <w:r>
         <w:rPr>
           <w:rFonts w:ascii="Times New Roman" w:hAnsi="Times New Roman"/>
           <w:sz w:val="19"/>
         </w:rPr>
-        <w:t>et al. (2022). The diagnostic and triage accuracy of digital and online symptom checker tools: a systematic review. npj Digital Medicine, 5:118. https://doi.org/10.1038/s41746-022-00667-w</w:t>
+        <w:t>gital and online symptom checker tools: a systematic review. npj Digital Medicine, 5:118. https://doi.org/10.1038/s41746-022-00667-w</w:t>
       </w:r>
     </w:p>
     <w:p>
@@ -18000,14 +18124,14 @@
           <w:rFonts w:ascii="Times New Roman" w:hAnsi="Times New Roman"/>
           <w:sz w:val="19"/>
         </w:rPr>
-        <w:t>Niculescu-Mizil, A., &amp; Caruana, R. (2005). Predicting good proba</w:t>
+        <w:t>Niculescu-Mizil, A., &amp; Caruana, R. (2005). Predicting good probabilities with supervised learning. In Proceedings of th</w:t>
       </w:r>
       <w:r>
         <w:rPr>
           <w:rFonts w:ascii="Times New Roman" w:hAnsi="Times New Roman"/>
           <w:sz w:val="19"/>
         </w:rPr>
-        <w:t>bilities with supervised learning. In Proceedings of the 22nd International Conference on Machine Learning (ICML '05), pp. 625–632. ACM. https://doi.org/10.1145/1102351.1102430</w:t>
+        <w:t>e 22nd International Conference on Machine Learning (ICML '05), pp. 625–632. ACM. https://doi.org/10.1145/1102351.1102430</w:t>
       </w:r>
     </w:p>
     <w:p>
@@ -18029,14 +18153,14 @@
           <w:rFonts w:ascii="Times New Roman" w:hAnsi="Times New Roman"/>
           <w:sz w:val="19"/>
         </w:rPr>
-        <w:t>Domingos, P., &amp; Pazzani, M. (1997). On the optimality of the simple Bayesia</w:t>
+        <w:t>Domingos, P., &amp; Pazzani, M. (1997). On the optimality of the simple Bayesian classifier under zero-one loss. Machine Learning, 29(</w:t>
       </w:r>
       <w:r>
         <w:rPr>
           <w:rFonts w:ascii="Times New Roman" w:hAnsi="Times New Roman"/>
           <w:sz w:val="19"/>
         </w:rPr>
-        <w:t>n classifier under zero-one loss. Machine Learning, 29(2), 103–130. https://doi.org/10.1023/A:1007413511361</w:t>
+        <w:t>2), 103–130. https://doi.org/10.1023/A:1007413511361</w:t>
       </w:r>
     </w:p>
     <w:p>
@@ -18058,14 +18182,7 @@
           <w:rFonts w:ascii="Times New Roman" w:hAnsi="Times New Roman"/>
           <w:sz w:val="19"/>
         </w:rPr>
-        <w:t>Ke, G., Meng, Q., Finley, T., et al. (2017). LightGBM: A highly efficient gradient boosting decision tree. Advances in Neural Information Proces</w:t>
-      </w:r>
-      <w:r>
-        <w:rPr>
-          <w:rFonts w:ascii="Times New Roman" w:hAnsi="Times New Roman"/>
-          <w:sz w:val="19"/>
-        </w:rPr>
-        <w:t>sing Systems (NeurIPS 2017), 30, 3146–3154.</w:t>
+        <w:t>Ke, G., Meng, Q., Finley, T., et al. (2017). LightGBM: A highly efficient gradient boosting decision tree. Advances in Neural Information Processing Systems (NeurIPS 2017), 30, 3146–3154.</w:t>
       </w:r>
     </w:p>
     <w:p>
@@ -18087,7 +18204,14 @@
           <w:rFonts w:ascii="Times New Roman" w:hAnsi="Times New Roman"/>
           <w:sz w:val="19"/>
         </w:rPr>
-        <w:t>Lundberg, S. M., &amp; Lee, S. I. (2017). A unified approach to interpreting model predictions. Advances in Neural Information Processing Systems (NeurIPS 2017), 30, 4765–4774.</w:t>
+        <w:t>Lundber</w:t>
+      </w:r>
+      <w:r>
+        <w:rPr>
+          <w:rFonts w:ascii="Times New Roman" w:hAnsi="Times New Roman"/>
+          <w:sz w:val="19"/>
+        </w:rPr>
+        <w:t>g, S. M., &amp; Lee, S. I. (2017). A unified approach to interpreting model predictions. Advances in Neural Information Processing Systems (NeurIPS 2017), 30, 4765–4774.</w:t>
       </w:r>
     </w:p>
     <w:p>
@@ -18109,14 +18233,14 @@
           <w:rFonts w:ascii="Times New Roman" w:hAnsi="Times New Roman"/>
           <w:sz w:val="19"/>
         </w:rPr>
-        <w:t>Ji, Z., Lee, N., Frieske, R., e</w:t>
+        <w:t>Ji, Z., Lee, N., Frieske, R., et al. (2023). Survey of hallucination in natural langua</w:t>
       </w:r>
       <w:r>
         <w:rPr>
           <w:rFonts w:ascii="Times New Roman" w:hAnsi="Times New Roman"/>
           <w:sz w:val="19"/>
         </w:rPr>
-        <w:t>t al. (2023). Survey of hallucination in natural language generation. ACM Computing Surveys, 55(12), 1–38. https://doi.org/10.1145/3571730</w:t>
+        <w:t>ge generation. ACM Computing Surveys, 55(12), 1–38. https://doi.org/10.1145/3571730</w:t>
       </w:r>
     </w:p>
     <w:p>
@@ -18138,14 +18262,7 @@
           <w:rFonts w:ascii="Times New Roman" w:hAnsi="Times New Roman"/>
           <w:sz w:val="19"/>
         </w:rPr>
-        <w:t>Singhal, K., Azizi, S., Tu, T., et al. (2023). Large language models encode clinical knowledge. Nature, 620(7972)</w:t>
-      </w:r>
-      <w:r>
-        <w:rPr>
-          <w:rFonts w:ascii="Times New Roman" w:hAnsi="Times New Roman"/>
-          <w:sz w:val="19"/>
-        </w:rPr>
-        <w:t>, 172–180. https://doi.org/10.1038/s41586-023-06291-2</w:t>
+        <w:t>Singhal, K., Azizi, S., Tu, T., et al. (2023). Large language models encode clinical knowledge. Nature, 620(7972), 172–180. https://doi.org/10.1038/s41586-023-06291-2</w:t>
       </w:r>
     </w:p>
     <w:p>
@@ -18160,28 +18277,8 @@
           <w:color w:val="154360"/>
           <w:sz w:val="19"/>
         </w:rPr>
-        <w:t xml:space="preserve">[8] </w:t>
-      </w:r>
-      <w:r>
-        <w:rPr>
-          <w:rFonts w:ascii="Times New Roman" w:hAnsi="Times New Roman"/>
-          <w:sz w:val="19"/>
-        </w:rPr>
-        <w:t xml:space="preserve">Biryukov, A., Dinu, D., &amp; Khovratovich, D. (2016). Argon2: New generation of memory-hard functions for password hashing. In IEEE European Symposium on Security and Privacy (EuroS&amp;P), pp. 292–302. </w:t>
-      </w:r>
-      <w:r>
-        <w:rPr>
-          <w:rFonts w:ascii="Times New Roman" w:hAnsi="Times New Roman"/>
-          <w:sz w:val="19"/>
-        </w:rPr>
-        <w:t>IEEE.</w:t>
-      </w:r>
-    </w:p>
-    <w:p>
-      <w:pPr>
-        <w:spacing w:before="40" w:after="80"/>
-        <w:jc w:val="both"/>
-      </w:pPr>
+        <w:t>[</w:t>
+      </w:r>
       <w:r>
         <w:rPr>
           <w:rFonts w:ascii="Times New Roman" w:hAnsi="Times New Roman"/>
@@ -18189,14 +18286,14 @@
           <w:color w:val="154360"/>
           <w:sz w:val="19"/>
         </w:rPr>
-        <w:t xml:space="preserve">[9] </w:t>
+        <w:t xml:space="preserve">8] </w:t>
       </w:r>
       <w:r>
         <w:rPr>
           <w:rFonts w:ascii="Times New Roman" w:hAnsi="Times New Roman"/>
           <w:sz w:val="19"/>
         </w:rPr>
-        <w:t>Kung, H. T., &amp; Robinson, J. T. (1981). On optimistic methods for concurrency control. ACM Transactions on Database Systems (TODS), 6(2), 213–226. https://doi.org/10.1145/319566.319567</w:t>
+        <w:t>Biryukov, A., Dinu, D., &amp; Khovratovich, D. (2016). Argon2: New generation of memory-hard functions for password hashing. In IEEE European Symposium on Security and Privacy (EuroS&amp;P), pp. 292–302. IEEE.</w:t>
       </w:r>
     </w:p>
     <w:p>
@@ -18211,21 +18308,21 @@
           <w:color w:val="154360"/>
           <w:sz w:val="19"/>
         </w:rPr>
-        <w:t xml:space="preserve">[10] </w:t>
+        <w:t xml:space="preserve">[9] </w:t>
       </w:r>
       <w:r>
         <w:rPr>
           <w:rFonts w:ascii="Times New Roman" w:hAnsi="Times New Roman"/>
           <w:sz w:val="19"/>
         </w:rPr>
-        <w:t xml:space="preserve">Ribeiro, M. T., Singh, S., &amp; Guestrin, C. (2016). "Why </w:t>
+        <w:t xml:space="preserve">Kung, H. T., &amp; Robinson, J. T. (1981). On </w:t>
       </w:r>
       <w:r>
         <w:rPr>
           <w:rFonts w:ascii="Times New Roman" w:hAnsi="Times New Roman"/>
           <w:sz w:val="19"/>
         </w:rPr>
-        <w:t>should I trust you?": Explaining the predictions of any classifier. In Proceedings of the 22nd ACM SIGKDD (KDD '16), pp. 1135–1144. ACM.</w:t>
+        <w:t>optimistic methods for concurrency control. ACM Transactions on Database Systems (TODS), 6(2), 213–226. https://doi.org/10.1145/319566.319567</w:t>
       </w:r>
     </w:p>
     <w:p>
@@ -18240,21 +18337,21 @@
           <w:color w:val="154360"/>
           <w:sz w:val="19"/>
         </w:rPr>
-        <w:t xml:space="preserve">[11] </w:t>
+        <w:t xml:space="preserve">[10] </w:t>
       </w:r>
       <w:r>
         <w:rPr>
           <w:rFonts w:ascii="Times New Roman" w:hAnsi="Times New Roman"/>
           <w:sz w:val="19"/>
         </w:rPr>
-        <w:t xml:space="preserve">Ministry of Law and Justice, Government of India. (2023). The Digital Personal Data Protection Act, 2023 (Act No. </w:t>
+        <w:t>Ribeiro, M. T., Singh, S., &amp; Guestrin, C. (2016). "Why should I trust you?": Explaining the predictions of an</w:t>
       </w:r>
       <w:r>
         <w:rPr>
           <w:rFonts w:ascii="Times New Roman" w:hAnsi="Times New Roman"/>
           <w:sz w:val="19"/>
         </w:rPr>
-        <w:t>22 of 2023). The Gazette of India, Extraordinary, Part II—Section 1.</w:t>
+        <w:t>y classifier. In Proceedings of the 22nd ACM SIGKDD (KDD '16), pp. 1135–1144. ACM.</w:t>
       </w:r>
     </w:p>
     <w:p>
@@ -18269,14 +18366,21 @@
           <w:color w:val="154360"/>
           <w:sz w:val="19"/>
         </w:rPr>
-        <w:t xml:space="preserve">[12] </w:t>
+        <w:t xml:space="preserve">[11] </w:t>
       </w:r>
       <w:r>
         <w:rPr>
           <w:rFonts w:ascii="Times New Roman" w:hAnsi="Times New Roman"/>
           <w:sz w:val="19"/>
         </w:rPr>
-        <w:t>World Health Organization. (2021). Ethics and governance of artificial intelligence for health: WHO guidance. World Health Organization. ISBN: 978-92-4-002920-0.</w:t>
+        <w:t>Ministry of Law and Justice, Government of India. (2023). The Digital Personal Data Protection Act, 2023 (Act No. 22 of 2023). The Gazette of India, Extraordinary, Part</w:t>
+      </w:r>
+      <w:r>
+        <w:rPr>
+          <w:rFonts w:ascii="Times New Roman" w:hAnsi="Times New Roman"/>
+          <w:sz w:val="19"/>
+        </w:rPr>
+        <w:t xml:space="preserve"> II—Section 1.</w:t>
       </w:r>
     </w:p>
     <w:p>
@@ -18291,21 +18395,14 @@
           <w:color w:val="154360"/>
           <w:sz w:val="19"/>
         </w:rPr>
-        <w:t xml:space="preserve">[13] </w:t>
+        <w:t xml:space="preserve">[12] </w:t>
       </w:r>
       <w:r>
         <w:rPr>
           <w:rFonts w:ascii="Times New Roman" w:hAnsi="Times New Roman"/>
           <w:sz w:val="19"/>
         </w:rPr>
-        <w:t xml:space="preserve">Indian Council </w:t>
-      </w:r>
-      <w:r>
-        <w:rPr>
-          <w:rFonts w:ascii="Times New Roman" w:hAnsi="Times New Roman"/>
-          <w:sz w:val="19"/>
-        </w:rPr>
-        <w:t>of Medical Research. (2023). Ethical guidelines for application of artificial intelligence in biomedical research and healthcare. ICMR, New Delhi, India.</w:t>
+        <w:t>World Health Organization. (2021). Ethics and governance of artificial intelligence for health: WHO guidance. World Health Organization. ISBN: 978-92-4-002920-0.</w:t>
       </w:r>
     </w:p>
     <w:p>
@@ -18320,21 +18417,21 @@
           <w:color w:val="154360"/>
           <w:sz w:val="19"/>
         </w:rPr>
-        <w:t xml:space="preserve">[14] </w:t>
+        <w:t xml:space="preserve">[13] </w:t>
       </w:r>
       <w:r>
         <w:rPr>
           <w:rFonts w:ascii="Times New Roman" w:hAnsi="Times New Roman"/>
           <w:sz w:val="19"/>
         </w:rPr>
-        <w:t>OWASP Foundation. (2021). OWASP Top 10:2021 The Ten Most Critical Web Application Security Risks.</w:t>
+        <w:t>Indian Council of Medical Research. (2023). Ethical guidelines for ap</w:t>
       </w:r>
       <w:r>
         <w:rPr>
           <w:rFonts w:ascii="Times New Roman" w:hAnsi="Times New Roman"/>
           <w:sz w:val="19"/>
         </w:rPr>
-        <w:t xml:space="preserve"> https://owasp.org/Top10/</w:t>
+        <w:t>plication of artificial intelligence in biomedical research and healthcare. ICMR, New Delhi, India.</w:t>
       </w:r>
     </w:p>
     <w:p>
@@ -18349,6 +18446,28 @@
           <w:color w:val="154360"/>
           <w:sz w:val="19"/>
         </w:rPr>
+        <w:t xml:space="preserve">[14] </w:t>
+      </w:r>
+      <w:r>
+        <w:rPr>
+          <w:rFonts w:ascii="Times New Roman" w:hAnsi="Times New Roman"/>
+          <w:sz w:val="19"/>
+        </w:rPr>
+        <w:t>OWASP Foundation. (2021). OWASP Top 10:2021 The Ten Most Critical Web Application Security Risks. https://owasp.org/Top10/</w:t>
+      </w:r>
+    </w:p>
+    <w:p>
+      <w:pPr>
+        <w:spacing w:before="40" w:after="80"/>
+        <w:jc w:val="both"/>
+      </w:pPr>
+      <w:r>
+        <w:rPr>
+          <w:rFonts w:ascii="Times New Roman" w:hAnsi="Times New Roman"/>
+          <w:b/>
+          <w:color w:val="154360"/>
+          <w:sz w:val="19"/>
+        </w:rPr>
         <w:t xml:space="preserve">[15] </w:t>
       </w:r>
       <w:r>
@@ -18356,7 +18475,14 @@
           <w:rFonts w:ascii="Times New Roman" w:hAnsi="Times New Roman"/>
           <w:sz w:val="19"/>
         </w:rPr>
-        <w:t>Dworkin, M. (2007). Recommendation for block cipher modes of operation: Galois/Counter Mode (GCM) and GMAC. NIST Special Publication 800-38D, National Institute of Standards and Technology.</w:t>
+        <w:t>Dworkin, M. (2007). Rec</w:t>
+      </w:r>
+      <w:r>
+        <w:rPr>
+          <w:rFonts w:ascii="Times New Roman" w:hAnsi="Times New Roman"/>
+          <w:sz w:val="19"/>
+        </w:rPr>
+        <w:t>ommendation for block cipher modes of operation: Galois/Counter Mode (GCM) and GMAC. NIST Special Publication 800-38D, National Institute of Standards and Technology.</w:t>
       </w:r>
     </w:p>
     <w:p>
@@ -18376,16 +18502,7 @@
           <w:sz w:val="28"/>
         </w:rPr>
         <w:lastRenderedPageBreak/>
-        <w:t>Appendix A: Engineering Challenge</w:t>
-      </w:r>
-      <w:r>
-        <w:rPr>
-          <w:rFonts w:ascii="Times New Roman" w:hAnsi="Times New Roman"/>
-          <w:b/>
-          <w:color w:val="154360"/>
-          <w:sz w:val="28"/>
-        </w:rPr>
-        <w:t>s, Root Causes, and Architectural Fixes</w:t>
+        <w:t>Appendix A: Engineering Challenges, Root Causes, and Architectural Fixes</w:t>
       </w:r>
     </w:p>
     <w:p>
@@ -18398,7 +18515,14 @@
           <w:rFonts w:ascii="Times New Roman" w:hAnsi="Times New Roman"/>
           <w:color w:val="212121"/>
         </w:rPr>
-        <w:t>Table A.1 documents ten primary engineering challenges diagnosed and remediated during project development.</w:t>
+        <w:t>Table A.1 docu</w:t>
+      </w:r>
+      <w:r>
+        <w:rPr>
+          <w:rFonts w:ascii="Times New Roman" w:hAnsi="Times New Roman"/>
+          <w:color w:val="212121"/>
+        </w:rPr>
+        <w:t>ments ten primary engineering challenges diagnosed and remediated during project development.</w:t>
       </w:r>
     </w:p>
     <w:p>
@@ -18427,10 +18551,10 @@
         <w:tblLook w:val="04A0" w:firstRow="1" w:lastRow="0" w:firstColumn="1" w:lastColumn="0" w:noHBand="0" w:noVBand="1"/>
       </w:tblPr>
       <w:tblGrid>
-        <w:gridCol w:w="1744"/>
-        <w:gridCol w:w="2473"/>
-        <w:gridCol w:w="2728"/>
-        <w:gridCol w:w="2803"/>
+        <w:gridCol w:w="1521"/>
+        <w:gridCol w:w="2139"/>
+        <w:gridCol w:w="2496"/>
+        <w:gridCol w:w="3592"/>
       </w:tblGrid>
       <w:tr>
         <w:trPr>
@@ -18484,16 +18608,7 @@
                 <w:color w:val="FFFFFF"/>
                 <w:sz w:val="17"/>
               </w:rPr>
-              <w:t>Diagnosed Root</w:t>
-            </w:r>
-            <w:r>
-              <w:rPr>
-                <w:rFonts w:ascii="Times New Roman" w:hAnsi="Times New Roman"/>
-                <w:b/>
-                <w:color w:val="FFFFFF"/>
-                <w:sz w:val="17"/>
-              </w:rPr>
-              <w:t xml:space="preserve"> Cause</w:t>
+              <w:t>Diagnosed Root Cause</w:t>
             </w:r>
           </w:p>
         </w:tc>
@@ -18611,14 +18726,14 @@
                 <w:rFonts w:ascii="Times New Roman" w:hAnsi="Times New Roman"/>
                 <w:sz w:val="15"/>
               </w:rPr>
-              <w:t xml:space="preserve">Traced to </w:t>
+              <w:t xml:space="preserve">Traced to in-process import failure inside container falling back </w:t>
             </w:r>
             <w:r>
               <w:rPr>
                 <w:rFonts w:ascii="Times New Roman" w:hAnsi="Times New Roman"/>
                 <w:sz w:val="15"/>
               </w:rPr>
-              <w:t>in-process import failure inside container falling back to legacy mock. Rewrote UI to route strictly through backend API `POST /api/v1/consultation/triage`; removed all mock fallbacks; enforced fail-closed HTTP 503 MODEL_UNAVAILABLE on ML outage.</w:t>
+              <w:t>to legacy mock. Rewrote UI to route strictly through backend API `POST /api/v1/consultation/triage`; removed all mock fallbacks; enforced fail-closed HTTP 503 MODEL_UNAVAILABLE on ML outage.</w:t>
             </w:r>
           </w:p>
         </w:tc>
@@ -18639,15 +18754,7 @@
                 <w:color w:val="546E7A"/>
                 <w:sz w:val="14"/>
               </w:rPr>
-              <w:t>docs/evid</w:t>
-            </w:r>
-            <w:r>
-              <w:rPr>
-                <w:rFonts w:ascii="Times New Roman" w:hAnsi="Times New Roman"/>
-                <w:color w:val="546E7A"/>
-                <w:sz w:val="14"/>
-              </w:rPr>
-              <w:t>ence/p0_root_cause.txt, p0_docker_tests.txt</w:t>
+              <w:t>docs/evidence/p0_root_cause.txt, p0_docker_tests.txt</w:t>
             </w:r>
           </w:p>
         </w:tc>
@@ -18674,7 +18781,15 @@
                 <w:b/>
                 <w:sz w:val="16"/>
               </w:rPr>
-              <w:t>Massive Dataset Duplication &amp; Evaluative Leakage</w:t>
+              <w:t>Massive Dat</w:t>
+            </w:r>
+            <w:r>
+              <w:rPr>
+                <w:rFonts w:ascii="Times New Roman" w:hAnsi="Times New Roman"/>
+                <w:b/>
+                <w:sz w:val="16"/>
+              </w:rPr>
+              <w:t>aset Duplication &amp; Evaluative Leakage</w:t>
             </w:r>
           </w:p>
         </w:tc>
@@ -18716,14 +18831,14 @@
                 <w:rFonts w:ascii="Times New Roman" w:hAnsi="Times New Roman"/>
                 <w:sz w:val="15"/>
               </w:rPr>
-              <w:t xml:space="preserve">Discovered 4,616 exact duplicate rows </w:t>
+              <w:t xml:space="preserve">Discovered 4,616 exact duplicate rows (93.8% duplication). Dropped duplicates to 304 unique </w:t>
             </w:r>
             <w:r>
               <w:rPr>
                 <w:rFonts w:ascii="Times New Roman" w:hAnsi="Times New Roman"/>
                 <w:sz w:val="15"/>
               </w:rPr>
-              <w:t>(93.8% duplication). Dropped duplicates to 304 unique ground-truth rows (~7.4 per class); instituted 5x3 Repeated Stratified K-Fold CV with in-fold symptom dropout to eliminate evaluation leakage.</w:t>
+              <w:t>ground-truth rows (~7.4 per class); instituted 5x3 Repeated Stratified K-Fold CV with in-fold symptom dropout to eliminate evaluation leakage.</w:t>
             </w:r>
           </w:p>
         </w:tc>
@@ -18771,15 +18886,7 @@
                 <w:b/>
                 <w:sz w:val="16"/>
               </w:rPr>
-              <w:t>Hardcoded</w:t>
-            </w:r>
-            <w:r>
-              <w:rPr>
-                <w:rFonts w:ascii="Times New Roman" w:hAnsi="Times New Roman"/>
-                <w:b/>
-                <w:sz w:val="16"/>
-              </w:rPr>
-              <w:t xml:space="preserve"> Cryptographic Fallback Keys in Source Code</w:t>
+              <w:t>Hardcoded Cryptographic Fallback Keys in Source Code</w:t>
             </w:r>
           </w:p>
         </w:tc>
@@ -18799,7 +18906,14 @@
                 <w:rFonts w:ascii="Times New Roman" w:hAnsi="Times New Roman"/>
                 <w:sz w:val="15"/>
               </w:rPr>
-              <w:t>Gitleaks audit and static analysis detected fallback encryption keys embedded in `src/utils/cryptoUtils.js` and `dataEncryption.js`.</w:t>
+              <w:t>Gitleaks a</w:t>
+            </w:r>
+            <w:r>
+              <w:rPr>
+                <w:rFonts w:ascii="Times New Roman" w:hAnsi="Times New Roman"/>
+                <w:sz w:val="15"/>
+              </w:rPr>
+              <w:t>udit and static analysis detected fallback encryption keys embedded in `src/utils/cryptoUtils.js` and `dataEncryption.js`.</w:t>
             </w:r>
           </w:p>
         </w:tc>
@@ -18819,14 +18933,14 @@
                 <w:rFonts w:ascii="Times New Roman" w:hAnsi="Times New Roman"/>
                 <w:sz w:val="15"/>
               </w:rPr>
-              <w:t>Removed all hardcoded fallback keys from source repository; updated gitleaks ba</w:t>
+              <w:t>Removed all hardcoded fallback keys from source repository; updated gitleaks baseline with written rationales; implemented production</w:t>
             </w:r>
             <w:r>
               <w:rPr>
                 <w:rFonts w:ascii="Times New Roman" w:hAnsi="Times New Roman"/>
                 <w:sz w:val="15"/>
               </w:rPr>
-              <w:t>seline with written rationales; implemented production startup guard `encryption_key_exit.test.js` verifying process exits with code 1 if ENCRYPTION_KEY is unset.</w:t>
+              <w:t xml:space="preserve"> startup guard `encryption_key_exit.test.js` verifying process exits with code 1 if ENCRYPTION_KEY is unset.</w:t>
             </w:r>
           </w:p>
         </w:tc>
@@ -18874,15 +18988,7 @@
                 <w:b/>
                 <w:sz w:val="16"/>
               </w:rPr>
-              <w:t>Unevidenced Acc</w:t>
-            </w:r>
-            <w:r>
-              <w:rPr>
-                <w:rFonts w:ascii="Times New Roman" w:hAnsi="Times New Roman"/>
-                <w:b/>
-                <w:sz w:val="16"/>
-              </w:rPr>
-              <w:t>uracy Figures in Initial Report Draft</w:t>
+              <w:t>Unevidenced Accuracy Figures in Initial Report Draft</w:t>
             </w:r>
           </w:p>
         </w:tc>
@@ -18903,7 +19009,14 @@
                 <w:rFonts w:ascii="Times New Roman" w:hAnsi="Times New Roman"/>
                 <w:sz w:val="15"/>
               </w:rPr>
-              <w:t>Fact-checking audit found numbers (99.67%, 95.39%, 83.22%, F1 0.9512, ECE 0.0384, Brier 0.0121) lacked supporting evidence files.</w:t>
+              <w:t xml:space="preserve">Fact-checking </w:t>
+            </w:r>
+            <w:r>
+              <w:rPr>
+                <w:rFonts w:ascii="Times New Roman" w:hAnsi="Times New Roman"/>
+                <w:sz w:val="15"/>
+              </w:rPr>
+              <w:t>audit found numbers (99.67%, 95.39%, 83.22%, F1 0.9512, ECE 0.0384, Brier 0.0121) lacked supporting evidence files.</w:t>
             </w:r>
           </w:p>
         </w:tc>
@@ -18924,14 +19037,14 @@
                 <w:rFonts w:ascii="Times New Roman" w:hAnsi="Times New Roman"/>
                 <w:sz w:val="15"/>
               </w:rPr>
-              <w:t xml:space="preserve">Removed unevidenced draft figures from report text; reconciled all performance claims </w:t>
+              <w:t>Removed unevidenced draft figures from report text; reconciled all performance claims with traceable nested CV benchmarks in `model_benchmar</w:t>
             </w:r>
             <w:r>
               <w:rPr>
                 <w:rFonts w:ascii="Times New Roman" w:hAnsi="Times New Roman"/>
                 <w:sz w:val="15"/>
               </w:rPr>
-              <w:t>with traceable nested CV benchmarks in `model_benchmark.md` and `tuned_tree_benchmark.md`.</w:t>
+              <w:t>k.md` and `tuned_tree_benchmark.md`.</w:t>
             </w:r>
           </w:p>
         </w:tc>
@@ -18999,14 +19112,14 @@
                 <w:rFonts w:ascii="Times New Roman" w:hAnsi="Times New Roman"/>
                 <w:sz w:val="15"/>
               </w:rPr>
-              <w:t>Early load test issued request</w:t>
+              <w:t xml:space="preserve">Early load test issued requests against production rate limiters, recording 429s as </w:t>
             </w:r>
             <w:r>
               <w:rPr>
                 <w:rFonts w:ascii="Times New Roman" w:hAnsi="Times New Roman"/>
                 <w:sz w:val="15"/>
               </w:rPr>
-              <w:t>s against production rate limiters, recording 429s as normal behavior while list endpoint had high latency.</w:t>
+              <w:t>normal behavior while list endpoint had high latency.</w:t>
             </w:r>
           </w:p>
         </w:tc>
@@ -19026,14 +19139,14 @@
                 <w:rFonts w:ascii="Times New Roman" w:hAnsi="Times New Roman"/>
                 <w:sz w:val="15"/>
               </w:rPr>
-              <w:t xml:space="preserve">Created dedicated `docker-compose.test.yml` with test-only limits (`ALLOW_LOAD_TEST=true`, `LLM_ENABLED=false`); pre-created pending consultations; </w:t>
+              <w:t xml:space="preserve">Created dedicated `docker-compose.test.yml` with test-only limits (`ALLOW_LOAD_TEST=true`, `LLM_ENABLED=false`); pre-created pending consultations; optimized worker list with server-side pagination and </w:t>
             </w:r>
             <w:r>
               <w:rPr>
                 <w:rFonts w:ascii="Times New Roman" w:hAnsi="Times New Roman"/>
                 <w:sz w:val="15"/>
               </w:rPr>
-              <w:t>optimized worker list with server-side pagination and projection.</w:t>
+              <w:t>projection.</w:t>
             </w:r>
           </w:p>
         </w:tc>
@@ -19102,14 +19215,14 @@
                 <w:rFonts w:ascii="Times New Roman" w:hAnsi="Times New Roman"/>
                 <w:sz w:val="15"/>
               </w:rPr>
-              <w:t xml:space="preserve">Naive in-place regex replacement of confidence terms </w:t>
+              <w:t xml:space="preserve">Naive in-place regex replacement of confidence terms ('certain', 'high') mangled valid clinical words like </w:t>
             </w:r>
             <w:r>
               <w:rPr>
                 <w:rFonts w:ascii="Times New Roman" w:hAnsi="Times New Roman"/>
                 <w:sz w:val="15"/>
               </w:rPr>
-              <w:t>('certain', 'high') mangled valid clinical words like 'certainly' or 'ascertain'.</w:t>
+              <w:t>'certainly' or 'ascertain'.</w:t>
             </w:r>
           </w:p>
         </w:tc>
@@ -19130,14 +19243,7 @@
                 <w:rFonts w:ascii="Times New Roman" w:hAnsi="Times New Roman"/>
                 <w:sz w:val="15"/>
               </w:rPr>
-              <w:t>Replaced regex replacement with whole-phrase boundary matching; on detection of banned confidence terms, triggers one LLM regeneration; if still failing, falls back cleanly t</w:t>
-            </w:r>
-            <w:r>
-              <w:rPr>
-                <w:rFonts w:ascii="Times New Roman" w:hAnsi="Times New Roman"/>
-                <w:sz w:val="15"/>
-              </w:rPr>
-              <w:t>o deterministic clinical template.</w:t>
+              <w:t>Replaced regex replacement with whole-phrase boundary matching; on detection of banned confidence terms, triggers one LLM regeneration; if still failing, falls back cleanly to deterministic clinical template.</w:t>
             </w:r>
           </w:p>
         </w:tc>
@@ -19159,7 +19265,15 @@
                 <w:color w:val="546E7A"/>
                 <w:sz w:val="14"/>
               </w:rPr>
-              <w:t>scripts/test_confidence_word_filter.py, docs/evidence/p2_guardrails_tests.txt</w:t>
+              <w:t>scripts/test_confid</w:t>
+            </w:r>
+            <w:r>
+              <w:rPr>
+                <w:rFonts w:ascii="Times New Roman" w:hAnsi="Times New Roman"/>
+                <w:color w:val="546E7A"/>
+                <w:sz w:val="14"/>
+              </w:rPr>
+              <w:t>ence_word_filter.py, docs/evidence/p2_guardrails_tests.txt</w:t>
             </w:r>
           </w:p>
         </w:tc>
@@ -19185,7 +19299,16 @@
                 <w:b/>
                 <w:sz w:val="16"/>
               </w:rPr>
-              <w:t>Gemini Model Deprecation &amp; API Quota Exhaustion</w:t>
+              <w:t xml:space="preserve">Gemini Model Deprecation &amp; API </w:t>
+            </w:r>
+            <w:r>
+              <w:rPr>
+                <w:rFonts w:ascii="Times New Roman" w:hAnsi="Times New Roman"/>
+                <w:b/>
+                <w:sz w:val="16"/>
+              </w:rPr>
+              <w:lastRenderedPageBreak/>
+              <w:t>Quota Exhaustion</w:t>
             </w:r>
           </w:p>
         </w:tc>
@@ -19205,14 +19328,16 @@
                 <w:rFonts w:ascii="Times New Roman" w:hAnsi="Times New Roman"/>
                 <w:sz w:val="15"/>
               </w:rPr>
-              <w:t>Gemini 1.5 Flash returned 404 model not found; free-tier API quota exhausted after 20 daily ca</w:t>
+              <w:lastRenderedPageBreak/>
+              <w:t xml:space="preserve">Gemini 1.5 Flash returned 404 model not found; free-tier API </w:t>
             </w:r>
             <w:r>
               <w:rPr>
                 <w:rFonts w:ascii="Times New Roman" w:hAnsi="Times New Roman"/>
                 <w:sz w:val="15"/>
               </w:rPr>
-              <w:t>lls returning HTTP 429.</w:t>
+              <w:lastRenderedPageBreak/>
+              <w:t>quota exhausted after 20 daily calls returning HTTP 429.</w:t>
             </w:r>
           </w:p>
         </w:tc>
@@ -19232,15 +19357,23 @@
                 <w:rFonts w:ascii="Times New Roman" w:hAnsi="Times New Roman"/>
                 <w:sz w:val="15"/>
               </w:rPr>
-              <w:t xml:space="preserve">Implemented dynamic ordered cascade `LLM_MODELS = ['gemini-2.5-flash', 'gemini-3.5-flash', 'gemini-3-flash-preview']`; added 10s per-attempt timeout and 20s overall cap; engaged deterministic </w:t>
+              <w:lastRenderedPageBreak/>
+              <w:t>Implemented dynamic ordered ca</w:t>
             </w:r>
             <w:r>
               <w:rPr>
                 <w:rFonts w:ascii="Times New Roman" w:hAnsi="Times New Roman"/>
                 <w:sz w:val="15"/>
               </w:rPr>
+              <w:t xml:space="preserve">scade `LLM_MODELS = ['gemini-2.5-flash', </w:t>
+            </w:r>
+            <w:r>
+              <w:rPr>
+                <w:rFonts w:ascii="Times New Roman" w:hAnsi="Times New Roman"/>
+                <w:sz w:val="15"/>
+              </w:rPr>
               <w:lastRenderedPageBreak/>
-              <w:t>safe template on exhaustion.</w:t>
+              <w:t>'gemini-3.5-flash', 'gemini-3-flash-preview']`; added 10s per-attempt timeout and 20s overall cap; engaged deterministic safe template on exhaustion.</w:t>
             </w:r>
           </w:p>
         </w:tc>
@@ -19262,7 +19395,7 @@
                 <w:sz w:val="14"/>
               </w:rPr>
               <w:lastRenderedPageBreak/>
-              <w:t>docs/eviden</w:t>
+              <w:t xml:space="preserve">docs/evidence/gemini_live_run.txt, </w:t>
             </w:r>
             <w:r>
               <w:rPr>
@@ -19270,7 +19403,16 @@
                 <w:color w:val="546E7A"/>
                 <w:sz w:val="14"/>
               </w:rPr>
-              <w:t>ce/gemini_live_run.txt, scripts/test_llm_timeouts_and_429.py</w:t>
+              <w:lastRenderedPageBreak/>
+              <w:t>scripts/test_llm_timeouts_and_</w:t>
+            </w:r>
+            <w:r>
+              <w:rPr>
+                <w:rFonts w:ascii="Times New Roman" w:hAnsi="Times New Roman"/>
+                <w:color w:val="546E7A"/>
+                <w:sz w:val="14"/>
+              </w:rPr>
+              <w:t>429.py</w:t>
             </w:r>
           </w:p>
         </w:tc>
@@ -19340,14 +19482,14 @@
                 <w:rFonts w:ascii="Times New Roman" w:hAnsi="Times New Roman"/>
                 <w:sz w:val="15"/>
               </w:rPr>
-              <w:t xml:space="preserve">Implemented multi-stage Docker build for </w:t>
+              <w:t xml:space="preserve">Implemented multi-stage Docker build for backend stripping npm CLI; uninstalled pip and </w:t>
             </w:r>
             <w:r>
               <w:rPr>
                 <w:rFonts w:ascii="Times New Roman" w:hAnsi="Times New Roman"/>
                 <w:sz w:val="15"/>
               </w:rPr>
-              <w:t>backend stripping npm CLI; uninstalled pip and ensurepip from runtime stages of Python images; upgraded critical packages; achieved zero fixable Critical/High with `--ignore-unfixed`.</w:t>
+              <w:t>ensurepip from runtime stages of Python images; upgraded critical packages; achieved zero fixable Critical/High with `--ignore-unfixed`.</w:t>
             </w:r>
           </w:p>
         </w:tc>
@@ -19415,7 +19557,14 @@
                 <w:rFonts w:ascii="Times New Roman" w:hAnsi="Times New Roman"/>
                 <w:sz w:val="15"/>
               </w:rPr>
-              <w:t>Load test showed worker consultation history dominating latency under sequential and concurrent load.</w:t>
+              <w:t xml:space="preserve">Load </w:t>
+            </w:r>
+            <w:r>
+              <w:rPr>
+                <w:rFonts w:ascii="Times New Roman" w:hAnsi="Times New Roman"/>
+                <w:sz w:val="15"/>
+              </w:rPr>
+              <w:t>test showed worker consultation history dominating latency under sequential and concurrent load.</w:t>
             </w:r>
           </w:p>
         </w:tc>
@@ -19435,14 +19584,14 @@
                 <w:rFonts w:ascii="Times New Roman" w:hAnsi="Times New Roman"/>
                 <w:sz w:val="15"/>
               </w:rPr>
-              <w:t>Added server-side pagination (`page`, `limit`, default 20) and lean Mongoose projection; combined optimization r</w:t>
+              <w:t>Added server-side pagination (`page`, `limit`, default 20) and lean Mongoose projection; combined optimization reduced C=1 p50 latency from 193.0 ms to 76.2 ms</w:t>
             </w:r>
             <w:r>
               <w:rPr>
                 <w:rFonts w:ascii="Times New Roman" w:hAnsi="Times New Roman"/>
                 <w:sz w:val="15"/>
               </w:rPr>
-              <w:t>educed C=1 p50 latency from 193.0 ms to 76.2 ms (60.5% faster) and p99 from 660.6 ms to 152.0 ms (77.0% faster). Cause not isolated.</w:t>
+              <w:t xml:space="preserve"> (60.5% faster) and p99 from 660.6 ms to 152.0 ms (77.0% faster). Cause not isolated.</w:t>
             </w:r>
           </w:p>
         </w:tc>
@@ -19490,15 +19639,7 @@
                 <w:b/>
                 <w:sz w:val="16"/>
               </w:rPr>
-              <w:t xml:space="preserve">Session Expiry &amp; Second-Opinion </w:t>
-            </w:r>
-            <w:r>
-              <w:rPr>
-                <w:rFonts w:ascii="Times New Roman" w:hAnsi="Times New Roman"/>
-                <w:b/>
-                <w:sz w:val="16"/>
-              </w:rPr>
-              <w:t>Escalation Lifecycle</w:t>
+              <w:t>Session Expiry &amp; Second-Opinion Escalation Lifecycle</w:t>
             </w:r>
           </w:p>
         </w:tc>
@@ -19519,7 +19660,14 @@
                 <w:rFonts w:ascii="Times New Roman" w:hAnsi="Times New Roman"/>
                 <w:sz w:val="15"/>
               </w:rPr>
-              <w:t>Frontline workers experienced silent token expiration, while clinician escalation saving and review workflows required dedicated integration.</w:t>
+              <w:t xml:space="preserve">Frontline workers experienced </w:t>
+            </w:r>
+            <w:r>
+              <w:rPr>
+                <w:rFonts w:ascii="Times New Roman" w:hAnsi="Times New Roman"/>
+                <w:sz w:val="15"/>
+              </w:rPr>
+              <w:t>silent token expiration, while clinician escalation saving and review workflows required dedicated integration.</w:t>
             </w:r>
           </w:p>
         </w:tc>
@@ -19540,14 +19688,14 @@
                 <w:rFonts w:ascii="Times New Roman" w:hAnsi="Times New Roman"/>
                 <w:sz w:val="15"/>
               </w:rPr>
-              <w:t xml:space="preserve">Designed explicit 401 session expiry warning in UI client and structured consultation review </w:t>
+              <w:t xml:space="preserve">Implemented explicit 401 session expiry banners and token refresh handling in the UI client, and established end-to-end multi-role consultation </w:t>
             </w:r>
             <w:r>
               <w:rPr>
                 <w:rFonts w:ascii="Times New Roman" w:hAnsi="Times New Roman"/>
                 <w:sz w:val="15"/>
               </w:rPr>
-              <w:t>state machine. Complete end-to-end multi-role persistence is scheduled for completion in [PENDING FIX ROUND].</w:t>
+              <w:t>persistence connecting worker escalation, physician review queue with OCC updates, and worker reviewed status inspection.</w:t>
             </w:r>
           </w:p>
         </w:tc>
@@ -19569,7 +19717,7 @@
                 <w:color w:val="546E7A"/>
                 <w:sz w:val="14"/>
               </w:rPr>
-              <w:t>ui/utils/api_client.py, docs/KNOWN_LIMITATIONS.md</w:t>
+              <w:t>ui/utils/api_client.py, backend/src/controllers/consultation/consultationController.js, docs/evidence/playwright_report.txt</w:t>
             </w:r>
           </w:p>
         </w:tc>
@@ -19605,14 +19753,14 @@
           <w:rFonts w:ascii="Times New Roman" w:hAnsi="Times New Roman"/>
           <w:color w:val="212121"/>
         </w:rPr>
-        <w:t xml:space="preserve">Listing B.1 provides the sequence of 10 </w:t>
+        <w:t>Listing B.1 provides the sequence of 10 command-line instructions to launch the cluster, execute all 322 automated test suites, run golden test cases, run Playwright journeys, execute load testing, and run securit</w:t>
       </w:r>
       <w:r>
         <w:rPr>
           <w:rFonts w:ascii="Times New Roman" w:hAnsi="Times New Roman"/>
           <w:color w:val="212121"/>
         </w:rPr>
-        <w:t>command-line instructions to launch the cluster, execute all 322 automated test suites, run golden test cases, run Playwright journeys, execute load testing, and run security scans.</w:t>
+        <w:t>y scans.</w:t>
       </w:r>
     </w:p>
     <w:tbl>
@@ -19658,7 +19806,7 @@
                 <w:sz w:val="16"/>
               </w:rPr>
               <w:br/>
-              <w:t>docker compose -f docker-co</w:t>
+              <w:t>docker compose -f docker-compose.yml up -d</w:t>
             </w:r>
             <w:r>
               <w:rPr>
@@ -19666,7 +19814,8 @@
                 <w:color w:val="EEFF41"/>
                 <w:sz w:val="16"/>
               </w:rPr>
-              <w:t>mpose.yml up -d</w:t>
+              <w:br/>
+              <w:t>powershell -File scripts/health_check.ps1</w:t>
             </w:r>
             <w:r>
               <w:rPr>
@@ -19675,7 +19824,6 @@
                 <w:sz w:val="16"/>
               </w:rPr>
               <w:br/>
-              <w:t>powershell -File scripts/health_check.ps1</w:t>
             </w:r>
             <w:r>
               <w:rPr>
@@ -19684,6 +19832,7 @@
                 <w:sz w:val="16"/>
               </w:rPr>
               <w:br/>
+              <w:t># 2. Seed clean test data</w:t>
             </w:r>
             <w:r>
               <w:rPr>
@@ -19692,7 +19841,7 @@
                 <w:sz w:val="16"/>
               </w:rPr>
               <w:br/>
-              <w:t># 2. Seed clean test data</w:t>
+              <w:t>powershell -File scripts/seed_docker.ps1</w:t>
             </w:r>
             <w:r>
               <w:rPr>
@@ -19701,7 +19850,6 @@
                 <w:sz w:val="16"/>
               </w:rPr>
               <w:br/>
-              <w:t>powershell -File scripts/seed_docker.ps1</w:t>
             </w:r>
             <w:r>
               <w:rPr>
@@ -19710,6 +19858,7 @@
                 <w:sz w:val="16"/>
               </w:rPr>
               <w:br/>
+              <w:t># 3. Execute Backend API test suite (231 tests</w:t>
             </w:r>
             <w:r>
               <w:rPr>
@@ -19717,8 +19866,7 @@
                 <w:color w:val="EEFF41"/>
                 <w:sz w:val="16"/>
               </w:rPr>
-              <w:br/>
-              <w:t># 3. Execute Backend API test suite (231 tests)</w:t>
+              <w:t>)</w:t>
             </w:r>
             <w:r>
               <w:rPr>
@@ -19744,7 +19892,7 @@
                 <w:sz w:val="16"/>
               </w:rPr>
               <w:br/>
-              <w:t># 4. Execute ML Engine tes</w:t>
+              <w:t># 4. Execute ML Engine test suite (55 tests)</w:t>
             </w:r>
             <w:r>
               <w:rPr>
@@ -19752,7 +19900,8 @@
                 <w:color w:val="EEFF41"/>
                 <w:sz w:val="16"/>
               </w:rPr>
-              <w:t>t suite (55 tests)</w:t>
+              <w:br/>
+              <w:t>docker compose exec -T ml pytest -v</w:t>
             </w:r>
             <w:r>
               <w:rPr>
@@ -19761,7 +19910,6 @@
                 <w:sz w:val="16"/>
               </w:rPr>
               <w:br/>
-              <w:t>docker compose exec -T ml pytest -v</w:t>
             </w:r>
             <w:r>
               <w:rPr>
@@ -19770,6 +19918,7 @@
                 <w:sz w:val="16"/>
               </w:rPr>
               <w:br/>
+              <w:t># 5. Execute Guarded LLM Graph test suite (26 tests)</w:t>
             </w:r>
             <w:r>
               <w:rPr>
@@ -19778,7 +19927,7 @@
                 <w:sz w:val="16"/>
               </w:rPr>
               <w:br/>
-              <w:t># 5. Execute Guarded LLM Graph test suite (26 tests)</w:t>
+              <w:t>docker compose exec -T graph pytest -v</w:t>
             </w:r>
             <w:r>
               <w:rPr>
@@ -19787,7 +19936,6 @@
                 <w:sz w:val="16"/>
               </w:rPr>
               <w:br/>
-              <w:t>docker compose exec -T graph pytest -v</w:t>
             </w:r>
             <w:r>
               <w:rPr>
@@ -19796,6 +19944,7 @@
                 <w:sz w:val="16"/>
               </w:rPr>
               <w:br/>
+              <w:t># 6. Execute Frontend UI</w:t>
             </w:r>
             <w:r>
               <w:rPr>
@@ -19803,8 +19952,7 @@
                 <w:color w:val="EEFF41"/>
                 <w:sz w:val="16"/>
               </w:rPr>
-              <w:br/>
-              <w:t># 6. Execute Frontend UI test suite (10 tests)</w:t>
+              <w:t xml:space="preserve"> test suite (10 tests)</w:t>
             </w:r>
             <w:r>
               <w:rPr>
@@ -19830,7 +19978,7 @@
                 <w:sz w:val="16"/>
               </w:rPr>
               <w:br/>
-              <w:t># 7. Run Golden C</w:t>
+              <w:t># 7. Run Golden Clinical Test Set (20 cases)</w:t>
             </w:r>
             <w:r>
               <w:rPr>
@@ -19838,7 +19986,8 @@
                 <w:color w:val="EEFF41"/>
                 <w:sz w:val="16"/>
               </w:rPr>
-              <w:t>linical Test Set (20 cases)</w:t>
+              <w:br/>
+              <w:t>python scripts/test_p0_golden_set.py</w:t>
             </w:r>
             <w:r>
               <w:rPr>
@@ -19847,7 +19996,6 @@
                 <w:sz w:val="16"/>
               </w:rPr>
               <w:br/>
-              <w:t>python scripts/test_p0_golden_set.py</w:t>
             </w:r>
             <w:r>
               <w:rPr>
@@ -19856,6 +20004,7 @@
                 <w:sz w:val="16"/>
               </w:rPr>
               <w:br/>
+              <w:t># 8. Run Playwright End-to-End Suite (11 journeys)</w:t>
             </w:r>
             <w:r>
               <w:rPr>
@@ -19864,7 +20013,7 @@
                 <w:sz w:val="16"/>
               </w:rPr>
               <w:br/>
-              <w:t># 8. Run Playwright End-to-End Suite (11 journeys)</w:t>
+              <w:t>node scripts/test_p4_playwright_suite.mjs</w:t>
             </w:r>
             <w:r>
               <w:rPr>
@@ -19873,7 +20022,6 @@
                 <w:sz w:val="16"/>
               </w:rPr>
               <w:br/>
-              <w:t>node scripts/test_p4_playwright_suite.mjs</w:t>
             </w:r>
             <w:r>
               <w:rPr>
@@ -19882,6 +20030,7 @@
                 <w:sz w:val="16"/>
               </w:rPr>
               <w:br/>
+              <w:t xml:space="preserve"># 9. Execute </w:t>
             </w:r>
             <w:r>
               <w:rPr>
@@ -19889,8 +20038,7 @@
                 <w:color w:val="EEFF41"/>
                 <w:sz w:val="16"/>
               </w:rPr>
-              <w:br/>
-              <w:t># 9. Execute Load Test Suite in test mode (2,400 requests)</w:t>
+              <w:t>Load Test Suite in test mode (2,400 requests)</w:t>
             </w:r>
             <w:r>
               <w:rPr>
@@ -19899,15 +20047,7 @@
                 <w:sz w:val="16"/>
               </w:rPr>
               <w:br/>
-              <w:t>docker compose -f docker-compose.test</w:t>
-            </w:r>
-            <w:r>
-              <w:rPr>
-                <w:rFonts w:ascii="Consolas" w:hAnsi="Consolas"/>
-                <w:color w:val="EEFF41"/>
-                <w:sz w:val="16"/>
-              </w:rPr>
-              <w:t>.yml up -d</w:t>
+              <w:t>docker compose -f docker-compose.test.yml up -d</w:t>
             </w:r>
             <w:r>
               <w:rPr>
@@ -19950,8 +20090,8 @@
     </w:tbl>
     <w:p/>
     <w:sectPr>
-      <w:headerReference w:type="default" r:id="rId18"/>
-      <w:footerReference w:type="default" r:id="rId19"/>
+      <w:headerReference w:type="default" r:id="rId19"/>
+      <w:footerReference w:type="default" r:id="rId20"/>
       <w:pgSz w:w="12240" w:h="15840"/>
       <w:pgMar w:top="1296" w:right="1296" w:bottom="1296" w:left="1296" w:header="720" w:footer="720" w:gutter="0"/>
       <w:pgNumType w:start="1"/>
@@ -20036,7 +20176,7 @@
       <w:rPr>
         <w:noProof/>
       </w:rPr>
-      <w:t>28</w:t>
+      <w:t>29</w:t>
     </w:r>
     <w:r>
       <w:fldChar w:fldCharType="end"/>
@@ -20104,7 +20244,16 @@
         <w:color w:val="546E7A"/>
         <w:sz w:val="17"/>
       </w:rPr>
-      <w:t>ArogyaMitra: AI-Assisted Healthcare Decision Support Prototype</w:t>
+      <w:t>ArogyaMitra: AI-Assiste</w:t>
+    </w:r>
+    <w:r>
+      <w:rPr>
+        <w:rFonts w:ascii="Times New Roman" w:hAnsi="Times New Roman"/>
+        <w:i/>
+        <w:color w:val="546E7A"/>
+        <w:sz w:val="17"/>
+      </w:rPr>
+      <w:t>d Healthcare Decision Support Prototype</w:t>
     </w:r>
   </w:p>
 </w:hdr>
@@ -32709,7 +32858,7 @@
 </file>
 
 <file path=customXml/itemProps1.xml><?xml version="1.0" encoding="utf-8"?>
-<ds:datastoreItem xmlns:ds="http://schemas.openxmlformats.org/officeDocument/2006/customXml" ds:itemID="{E67A4211-D0B1-4E34-B396-A8AEF387120B}">
+<ds:datastoreItem xmlns:ds="http://schemas.openxmlformats.org/officeDocument/2006/customXml" ds:itemID="{A3069044-7278-4ABC-835F-9448D3E659B2}">
   <ds:schemaRefs>
     <ds:schemaRef ds:uri="http://schemas.openxmlformats.org/officeDocument/2006/bibliography"/>
   </ds:schemaRefs>

</xml_diff>